<commit_message>
Add example with relative link to another chapter
</commit_message>
<xml_diff>
--- a/tests/_fixtures/split-to-multiple-chapters/manuscript.docx
+++ b/tests/_fixtures/split-to-multiple-chapters/manuscript.docx
@@ -150,11 +150,9 @@
             <w:r>
               <w:t>_</w:t>
             </w:r>
-            <w:proofErr w:type="spellStart"/>
             <w:r>
               <w:t>isbn</w:t>
             </w:r>
-            <w:proofErr w:type="spellEnd"/>
           </w:p>
         </w:tc>
         <w:tc>
@@ -167,15 +165,7 @@
               <w:cnfStyle w:val="000000100000" w:firstRow="0" w:lastRow="0" w:firstColumn="0" w:lastColumn="0" w:oddVBand="0" w:evenVBand="0" w:oddHBand="1" w:evenHBand="0" w:firstRowFirstColumn="0" w:firstRowLastColumn="0" w:lastRowFirstColumn="0" w:lastRowLastColumn="0"/>
             </w:pPr>
             <w:r>
-              <w:t>{</w:t>
-            </w:r>
-            <w:proofErr w:type="spellStart"/>
-            <w:r>
-              <w:t>ebook</w:t>
-            </w:r>
-            <w:proofErr w:type="spellEnd"/>
-            <w:r>
-              <w:t>: 9876543210123, hardcover: 9876543210123, paperback: 9876543210123}</w:t>
+              <w:t>{ebook: 9876543210123, hardcover: 9876543210123, paperback: 9876543210123}</w:t>
             </w:r>
           </w:p>
         </w:tc>
@@ -240,11 +230,9 @@
             <w:pPr>
               <w:pStyle w:val="Frontmatter"/>
             </w:pPr>
-            <w:proofErr w:type="spellStart"/>
             <w:r>
               <w:t>open_access</w:t>
             </w:r>
-            <w:proofErr w:type="spellEnd"/>
           </w:p>
         </w:tc>
         <w:tc>
@@ -305,11 +293,9 @@
             <w:pPr>
               <w:pStyle w:val="Frontmatter"/>
             </w:pPr>
-            <w:proofErr w:type="spellStart"/>
             <w:r>
               <w:t>github</w:t>
             </w:r>
-            <w:proofErr w:type="spellEnd"/>
           </w:p>
         </w:tc>
         <w:tc>
@@ -432,15 +418,7 @@
               <w:t xml:space="preserve">, </w:t>
             </w:r>
             <w:r>
-              <w:t>slug: is-</w:t>
-            </w:r>
-            <w:proofErr w:type="spellStart"/>
-            <w:r>
-              <w:t>unicode</w:t>
-            </w:r>
-            <w:proofErr w:type="spellEnd"/>
-            <w:r>
-              <w:t>-handled-well</w:t>
+              <w:t>slug: is-unicode-handled-well</w:t>
             </w:r>
             <w:r>
               <w:t xml:space="preserve">, </w:t>
@@ -449,24 +427,14 @@
               <w:t>prefix: 2</w:t>
             </w:r>
             <w:r>
-              <w:t xml:space="preserve">, </w:t>
-            </w:r>
-            <w:proofErr w:type="spellStart"/>
-            <w:r>
-              <w:t>fn</w:t>
-            </w:r>
-            <w:proofErr w:type="spellEnd"/>
-            <w:r>
-              <w:t xml:space="preserve">: </w:t>
-            </w:r>
-            <w:proofErr w:type="spellStart"/>
+              <w:t xml:space="preserve">, fn: </w:t>
+            </w:r>
             <w:r>
               <w:t>is_unicode_with_custom</w:t>
             </w:r>
             <w:r>
               <w:t>_file_name</w:t>
             </w:r>
-            <w:proofErr w:type="spellEnd"/>
             <w:r>
               <w:t>}</w:t>
             </w:r>
@@ -536,11 +504,9 @@
             <w:r>
               <w:t>./assets/</w:t>
             </w:r>
-            <w:proofErr w:type="spellStart"/>
             <w:r>
               <w:t>thumbnail.svg</w:t>
             </w:r>
-            <w:proofErr w:type="spellEnd"/>
           </w:p>
         </w:tc>
       </w:tr>
@@ -560,95 +526,7 @@
         <w:jc w:val="both"/>
       </w:pPr>
       <w:r>
-        <w:t xml:space="preserve">Lorem ipsum </w:t>
-      </w:r>
-      <w:proofErr w:type="spellStart"/>
-      <w:r>
-        <w:t>dolor</w:t>
-      </w:r>
-      <w:proofErr w:type="spellEnd"/>
-      <w:r>
-        <w:t xml:space="preserve"> sit </w:t>
-      </w:r>
-      <w:proofErr w:type="spellStart"/>
-      <w:r>
-        <w:t>amet</w:t>
-      </w:r>
-      <w:proofErr w:type="spellEnd"/>
-      <w:r>
-        <w:t xml:space="preserve">, </w:t>
-      </w:r>
-      <w:proofErr w:type="spellStart"/>
-      <w:r>
-        <w:t>consectetur</w:t>
-      </w:r>
-      <w:proofErr w:type="spellEnd"/>
-      <w:r>
-        <w:t xml:space="preserve"> </w:t>
-      </w:r>
-      <w:proofErr w:type="spellStart"/>
-      <w:r>
-        <w:t>adipiscing</w:t>
-      </w:r>
-      <w:proofErr w:type="spellEnd"/>
-      <w:r>
-        <w:t xml:space="preserve"> </w:t>
-      </w:r>
-      <w:proofErr w:type="spellStart"/>
-      <w:r>
-        <w:t>elit</w:t>
-      </w:r>
-      <w:proofErr w:type="spellEnd"/>
-      <w:r>
-        <w:t xml:space="preserve">, </w:t>
-      </w:r>
-      <w:proofErr w:type="spellStart"/>
-      <w:r>
-        <w:t>sed</w:t>
-      </w:r>
-      <w:proofErr w:type="spellEnd"/>
-      <w:r>
-        <w:t xml:space="preserve"> do </w:t>
-      </w:r>
-      <w:proofErr w:type="spellStart"/>
-      <w:r>
-        <w:t>eiusmod</w:t>
-      </w:r>
-      <w:proofErr w:type="spellEnd"/>
-      <w:r>
-        <w:t xml:space="preserve"> </w:t>
-      </w:r>
-      <w:proofErr w:type="spellStart"/>
-      <w:r>
-        <w:t>tempor</w:t>
-      </w:r>
-      <w:proofErr w:type="spellEnd"/>
-      <w:r>
-        <w:t xml:space="preserve"> </w:t>
-      </w:r>
-      <w:proofErr w:type="spellStart"/>
-      <w:r>
-        <w:t>incididunt</w:t>
-      </w:r>
-      <w:proofErr w:type="spellEnd"/>
-      <w:r>
-        <w:t xml:space="preserve"> </w:t>
-      </w:r>
-      <w:proofErr w:type="spellStart"/>
-      <w:r>
-        <w:t>ut</w:t>
-      </w:r>
-      <w:proofErr w:type="spellEnd"/>
-      <w:r>
-        <w:t xml:space="preserve"> labore et dolore magna </w:t>
-      </w:r>
-      <w:proofErr w:type="spellStart"/>
-      <w:r>
-        <w:t>aliqua</w:t>
-      </w:r>
-      <w:proofErr w:type="spellEnd"/>
-      <w:r>
-        <w:t>.</w:t>
+        <w:t>Lorem ipsum dolor sit amet, consectetur adipiscing elit, sed do eiusmod tempor incididunt ut labore et dolore magna aliqua.</w:t>
       </w:r>
     </w:p>
     <w:p/>
@@ -670,8 +548,8 @@
       </w:pPr>
       <w:bookmarkStart w:id="2" w:name="_Heading"/>
       <w:bookmarkStart w:id="3" w:name="a_heading"/>
+      <w:bookmarkEnd w:id="1"/>
       <w:bookmarkEnd w:id="2"/>
-      <w:bookmarkEnd w:id="1"/>
       <w:r>
         <w:t>In-file targets</w:t>
       </w:r>
@@ -1099,13 +977,39 @@
       <w:pPr>
         <w:pStyle w:val="BodyText"/>
         <w:jc w:val="both"/>
-        <w:rPr>
-          <w:color w:val="F2F2F2" w:themeColor="background1" w:themeShade="F2"/>
-        </w:rPr>
-      </w:pPr>
+      </w:pPr>
+      <w:r>
+        <w:t xml:space="preserve">Also, see a </w:t>
+      </w:r>
+      <w:hyperlink r:id="rId12" w:anchor="tbl_aSimpleTable" w:history="1">
+        <w:r>
+          <w:rPr>
+            <w:rStyle w:val="Hyperlink"/>
+          </w:rPr>
+          <w:t xml:space="preserve">RELATIVE </w:t>
+        </w:r>
+        <w:r>
+          <w:rPr>
+            <w:rStyle w:val="Hyperlink"/>
+          </w:rPr>
+          <w:t>link to a table in chapter 2</w:t>
+        </w:r>
+      </w:hyperlink>
+      <w:r>
+        <w:t>.</w:t>
+      </w:r>
     </w:p>
     <w:p>
       <w:pPr>
+        <w:pStyle w:val="BodyText"/>
+        <w:jc w:val="both"/>
+        <w:rPr>
+          <w:color w:val="F2F2F2" w:themeColor="background1" w:themeShade="F2"/>
+        </w:rPr>
+      </w:pPr>
+    </w:p>
+    <w:p>
+      <w:pPr>
         <w:pStyle w:val="Caption"/>
         <w:rPr>
           <w:i w:val="0"/>
@@ -1157,7 +1061,7 @@
           <w:iCs/>
           <w:noProof/>
         </w:rPr>
-        <w:t>1.1</w:t>
+        <w:t>2.1</w:t>
       </w:r>
       <w:r>
         <w:rPr>
@@ -1507,6 +1411,7 @@
         <w:jc w:val="both"/>
       </w:pPr>
       <w:r>
+        <w:lastRenderedPageBreak/>
         <w:t xml:space="preserve">Complex numbering: </w:t>
       </w:r>
       <w:hyperlink w:anchor="equationWithComplexNumbering" w:history="1">
@@ -1597,7 +1502,7 @@
         <w:fldChar w:fldCharType="separate"/>
       </w:r>
       <w:r>
-        <w:t>2.1</w:t>
+        <w:t>3.2</w:t>
       </w:r>
       <w:r>
         <w:fldChar w:fldCharType="end"/>
@@ -1615,7 +1520,7 @@
         <w:fldChar w:fldCharType="separate"/>
       </w:r>
       <w:r>
-        <w:t>2.1</w:t>
+        <w:t>3.2</w:t>
       </w:r>
       <w:r>
         <w:fldChar w:fldCharType="end"/>
@@ -1648,7 +1553,7 @@
           <w:bCs/>
           <w:noProof/>
         </w:rPr>
-        <w:t>2</w:t>
+        <w:t>3</w:t>
       </w:r>
       <w:r>
         <w:fldChar w:fldCharType="end"/>
@@ -1924,7 +1829,7 @@
       <w:r>
         <w:pict w14:anchorId="5EE2F14B">
           <v:shape id="_x0000_i1026" type="#_x0000_t75" alt="The&#10;&#10;Alt&#10;&#10;Text" style="width:7.5pt;height:7.5pt;visibility:visible;mso-wrap-style:square">
-            <v:imagedata r:id="rId12" o:title="The&#10;&#10;Alt&#10;&#10;Text"/>
+            <v:imagedata r:id="rId13" o:title="The&#10;&#10;Alt&#10;&#10;Text"/>
           </v:shape>
         </w:pict>
       </w:r>
@@ -1949,7 +1854,7 @@
         </w:rPr>
         <w:t xml:space="preserve">a </w:t>
       </w:r>
-      <w:hyperlink r:id="rId13" w:history="1">
+      <w:hyperlink r:id="rId14" w:history="1">
         <w:r>
           <w:rPr>
             <w:rStyle w:val="Hyperlink"/>
@@ -2548,7 +2453,7 @@
         <v:path o:extrusionok="f" gradientshapeok="t" o:connecttype="rect"/>
         <o:lock v:ext="edit" aspectratio="t"/>
       </v:shapetype>
-      <v:shape id="Picture 1876436753" o:spid="_x0000_i1026" type="#_x0000_t75" alt="The&#10;&#10;Alt&#10;&#10;Text" style="width:7.5pt;height:7.5pt;visibility:visible;mso-wrap-style:square" o:bullet="t">
+      <v:shape id="_x0000_i1033" type="#_x0000_t75" alt="The&#10;&#10;Alt&#10;&#10;Text" style="width:7.5pt;height:7.5pt;visibility:visible;mso-wrap-style:square" o:bullet="t">
         <v:imagedata r:id="rId1" o:title="The&#10;&#10;Alt&#10;&#10;Text"/>
       </v:shape>
     </w:pict>

</xml_diff>

<commit_message>
Add footnotes examples to docx to split
</commit_message>
<xml_diff>
--- a/tests/_fixtures/split-to-multiple-chapters/manuscript.docx
+++ b/tests/_fixtures/split-to-multiple-chapters/manuscript.docx
@@ -526,7 +526,16 @@
         <w:jc w:val="both"/>
       </w:pPr>
       <w:r>
-        <w:t>Lorem ipsum dolor sit amet, consectetur adipiscing elit, sed do eiusmod tempor incididunt ut labore et dolore magna aliqua.</w:t>
+        <w:t>Lorem ipsum dolor sit amet, consectetur adipiscing elit, sed do eiusmod tempor incididunt ut labore et dolore magna aliqua</w:t>
+      </w:r>
+      <w:r>
+        <w:rPr>
+          <w:rStyle w:val="FootnoteReference"/>
+        </w:rPr>
+        <w:footnoteReference w:id="1"/>
+      </w:r>
+      <w:r>
+        <w:t>.</w:t>
       </w:r>
     </w:p>
     <w:p/>
@@ -1281,6 +1290,7 @@
         <w:pStyle w:val="Heading2"/>
       </w:pPr>
       <w:r>
+        <w:lastRenderedPageBreak/>
         <w:t>In-file ref</w:t>
       </w:r>
       <w:r>
@@ -1293,7 +1303,16 @@
         <w:jc w:val="both"/>
       </w:pPr>
       <w:r>
-        <w:t xml:space="preserve">In the same file: </w:t>
+        <w:t>In the same file</w:t>
+      </w:r>
+      <w:r>
+        <w:rPr>
+          <w:rStyle w:val="FootnoteReference"/>
+        </w:rPr>
+        <w:footnoteReference w:id="2"/>
+      </w:r>
+      <w:r>
+        <w:t xml:space="preserve">: </w:t>
       </w:r>
       <w:r>
         <w:t xml:space="preserve">Link to </w:t>
@@ -1411,7 +1430,6 @@
         <w:jc w:val="both"/>
       </w:pPr>
       <w:r>
-        <w:lastRenderedPageBreak/>
         <w:t xml:space="preserve">Complex numbering: </w:t>
       </w:r>
       <w:hyperlink w:anchor="equationWithComplexNumbering" w:history="1">
@@ -2059,7 +2077,16 @@
         <w:jc w:val="both"/>
       </w:pPr>
       <w:r>
-        <w:t>Text.</w:t>
+        <w:t>Text</w:t>
+      </w:r>
+      <w:r>
+        <w:rPr>
+          <w:rStyle w:val="FootnoteReference"/>
+        </w:rPr>
+        <w:footnoteReference w:id="3"/>
+      </w:r>
+      <w:r>
+        <w:t>.</w:t>
       </w:r>
     </w:p>
     <w:p>
@@ -2424,6 +2451,72 @@
       </w:pPr>
       <w:r>
         <w:continuationSeparator/>
+      </w:r>
+    </w:p>
+  </w:footnote>
+  <w:footnote w:id="1">
+    <w:p>
+      <w:pPr>
+        <w:pStyle w:val="FootnoteText"/>
+        <w:rPr>
+          <w:lang w:val="en-US"/>
+        </w:rPr>
+      </w:pPr>
+      <w:r>
+        <w:rPr>
+          <w:rStyle w:val="FootnoteReference"/>
+        </w:rPr>
+        <w:footnoteRef/>
+      </w:r>
+      <w:r>
+        <w:t xml:space="preserve"> </w:t>
+      </w:r>
+      <w:r>
+        <w:rPr>
+          <w:lang w:val="en-US"/>
+        </w:rPr>
+        <w:t>Footnote in index.</w:t>
+      </w:r>
+    </w:p>
+  </w:footnote>
+  <w:footnote w:id="2">
+    <w:p>
+      <w:pPr>
+        <w:pStyle w:val="FootnoteText"/>
+      </w:pPr>
+      <w:r>
+        <w:rPr>
+          <w:rStyle w:val="FootnoteReference"/>
+        </w:rPr>
+        <w:footnoteRef/>
+      </w:r>
+      <w:r>
+        <w:t xml:space="preserve"> Footnote in first chapter.</w:t>
+      </w:r>
+    </w:p>
+  </w:footnote>
+  <w:footnote w:id="3">
+    <w:p>
+      <w:pPr>
+        <w:pStyle w:val="FootnoteText"/>
+        <w:rPr>
+          <w:lang w:val="en-US"/>
+        </w:rPr>
+      </w:pPr>
+      <w:r>
+        <w:rPr>
+          <w:rStyle w:val="FootnoteReference"/>
+        </w:rPr>
+        <w:footnoteRef/>
+      </w:r>
+      <w:r>
+        <w:t xml:space="preserve"> </w:t>
+      </w:r>
+      <w:r>
+        <w:rPr>
+          <w:lang w:val="en-US"/>
+        </w:rPr>
+        <w:t>Footnote in last chapter.</w:t>
       </w:r>
     </w:p>
   </w:footnote>
@@ -2453,7 +2546,7 @@
         <v:path o:extrusionok="f" gradientshapeok="t" o:connecttype="rect"/>
         <o:lock v:ext="edit" aspectratio="t"/>
       </v:shapetype>
-      <v:shape id="_x0000_i1033" type="#_x0000_t75" alt="The&#10;&#10;Alt&#10;&#10;Text" style="width:7.5pt;height:7.5pt;visibility:visible;mso-wrap-style:square" o:bullet="t">
+      <v:shape id="_x0000_i1026" type="#_x0000_t75" alt="The&#10;&#10;Alt&#10;&#10;Text" style="width:7.5pt;height:7.5pt;visibility:visible;mso-wrap-style:square" o:bullet="t">
         <v:imagedata r:id="rId1" o:title="The&#10;&#10;Alt&#10;&#10;Text"/>
       </v:shape>
     </w:pict>

</xml_diff>

<commit_message>
Update split-document example with explicit filenames in the frontmatter
</commit_message>
<xml_diff>
--- a/tests/_fixtures/split-to-multiple-chapters/manuscript.docx
+++ b/tests/_fixtures/split-to-multiple-chapters/manuscript.docx
@@ -415,7 +415,22 @@
               <w:cnfStyle w:val="000000100000" w:firstRow="0" w:lastRow="0" w:firstColumn="0" w:lastColumn="0" w:oddVBand="0" w:evenVBand="0" w:oddHBand="1" w:evenHBand="0" w:firstRowFirstColumn="0" w:firstRowLastColumn="0" w:lastRowFirstColumn="0" w:lastRowLastColumn="0"/>
             </w:pPr>
             <w:r>
-              <w:t>{bookmark: h1_index, slug: index, prefix: I}</w:t>
+              <w:t>{bookmark: h1_index, slug: index, prefix: I</w:t>
+            </w:r>
+            <w:r>
+              <w:t xml:space="preserve">, </w:t>
+            </w:r>
+            <w:r>
+              <w:t xml:space="preserve">slug: </w:t>
+            </w:r>
+            <w:r>
+              <w:t>00_</w:t>
+            </w:r>
+            <w:r>
+              <w:t>index</w:t>
+            </w:r>
+            <w:r>
+              <w:t>}</w:t>
             </w:r>
           </w:p>
           <w:p>
@@ -428,7 +443,24 @@
               <w:cnfStyle w:val="000000100000" w:firstRow="0" w:lastRow="0" w:firstColumn="0" w:lastColumn="0" w:oddVBand="0" w:evenVBand="0" w:oddHBand="1" w:evenHBand="0" w:firstRowFirstColumn="0" w:firstRowLastColumn="0" w:lastRowFirstColumn="0" w:lastRowLastColumn="0"/>
             </w:pPr>
             <w:r>
-              <w:t>{bookmark: h1_infile, slug: in-file, prefix: 1}</w:t>
+              <w:t>{bookmark: h1_infile, slug: in-file, prefix: 1</w:t>
+            </w:r>
+            <w:r>
+              <w:t xml:space="preserve">, </w:t>
+            </w:r>
+            <w:proofErr w:type="spellStart"/>
+            <w:r>
+              <w:t>fn</w:t>
+            </w:r>
+            <w:proofErr w:type="spellEnd"/>
+            <w:r>
+              <w:t>: 0</w:t>
+            </w:r>
+            <w:r>
+              <w:t>1_infile</w:t>
+            </w:r>
+            <w:r>
+              <w:t>}</w:t>
             </w:r>
           </w:p>
           <w:p>
@@ -474,14 +506,15 @@
             <w:r>
               <w:t xml:space="preserve">: </w:t>
             </w:r>
-            <w:proofErr w:type="spellStart"/>
+            <w:r>
+              <w:t>02_</w:t>
+            </w:r>
             <w:r>
               <w:t>is_unicode_with_custom</w:t>
             </w:r>
             <w:r>
               <w:t>_file_name</w:t>
             </w:r>
-            <w:proofErr w:type="spellEnd"/>
             <w:r>
               <w:t>}</w:t>
             </w:r>
@@ -2702,7 +2735,7 @@
         <v:path o:extrusionok="f" gradientshapeok="t" o:connecttype="rect"/>
         <o:lock v:ext="edit" aspectratio="t"/>
       </v:shapetype>
-      <v:shape id="_x0000_i1030" type="#_x0000_t75" alt="The&#10;&#10;Alt&#10;&#10;Text" style="width:7.5pt;height:7.5pt;visibility:visible;mso-wrap-style:square" o:bullet="t">
+      <v:shape id="_x0000_i1027" type="#_x0000_t75" alt="The&#10;&#10;Alt&#10;&#10;Text" style="width:7.5pt;height:7.5pt;visibility:visible;mso-wrap-style:square" o:bullet="t">
         <v:imagedata r:id="rId1" o:title="The&#10;&#10;Alt&#10;&#10;Text"/>
       </v:shape>
     </w:pict>

</xml_diff>

<commit_message>
Change example - project level config should be in the config file, not in the docx frontmatter
</commit_message>
<xml_diff>
--- a/tests/_fixtures/split-to-multiple-chapters/manuscript.docx
+++ b/tests/_fixtures/split-to-multiple-chapters/manuscript.docx
@@ -56,10 +56,10 @@
               <w:pStyle w:val="Frontmatter"/>
             </w:pPr>
             <w:r>
-              <w:t>T</w:t>
-            </w:r>
-            <w:r>
-              <w:t>itle</w:t>
+              <w:t>_</w:t>
+            </w:r>
+            <w:r>
+              <w:t>split</w:t>
             </w:r>
           </w:p>
         </w:tc>
@@ -73,7 +73,7 @@
               <w:cnfStyle w:val="000000100000" w:firstRow="0" w:lastRow="0" w:firstColumn="0" w:lastColumn="0" w:oddVBand="0" w:evenVBand="0" w:oddHBand="1" w:evenHBand="0" w:firstRowFirstColumn="0" w:firstRowLastColumn="0" w:lastRowFirstColumn="0" w:lastRowLastColumn="0"/>
             </w:pPr>
             <w:r>
-              <w:t>Just a book</w:t>
+              <w:t>true</w:t>
             </w:r>
           </w:p>
         </w:tc>
@@ -89,311 +89,6 @@
               <w:pStyle w:val="Frontmatter"/>
             </w:pPr>
             <w:r>
-              <w:t>A</w:t>
-            </w:r>
-            <w:r>
-              <w:t>uthors</w:t>
-            </w:r>
-          </w:p>
-        </w:tc>
-        <w:tc>
-          <w:tcPr>
-            <w:tcW w:w="7719" w:type="dxa"/>
-          </w:tcPr>
-          <w:p>
-            <w:pPr>
-              <w:pStyle w:val="Frontmatter"/>
-              <w:numPr>
-                <w:ilvl w:val="0"/>
-                <w:numId w:val="4"/>
-              </w:numPr>
-              <w:cnfStyle w:val="000000000000" w:firstRow="0" w:lastRow="0" w:firstColumn="0" w:lastColumn="0" w:oddVBand="0" w:evenVBand="0" w:oddHBand="0" w:evenHBand="0" w:firstRowFirstColumn="0" w:firstRowLastColumn="0" w:lastRowFirstColumn="0" w:lastRowLastColumn="0"/>
-            </w:pPr>
-            <w:r>
-              <w:t>{name: Pawel Kaminski, affiliations: University of Luxembourg}</w:t>
-            </w:r>
-          </w:p>
-          <w:p>
-            <w:pPr>
-              <w:pStyle w:val="Frontmatter"/>
-              <w:numPr>
-                <w:ilvl w:val="0"/>
-                <w:numId w:val="4"/>
-              </w:numPr>
-              <w:cnfStyle w:val="000000000000" w:firstRow="0" w:lastRow="0" w:firstColumn="0" w:lastColumn="0" w:oddVBand="0" w:evenVBand="0" w:oddHBand="0" w:evenHBand="0" w:firstRowFirstColumn="0" w:firstRowLastColumn="0" w:lastRowFirstColumn="0" w:lastRowLastColumn="0"/>
-            </w:pPr>
-            <w:r>
-              <w:t xml:space="preserve">{name: </w:t>
-            </w:r>
-            <w:r>
-              <w:t>Elisabeth Guerard</w:t>
-            </w:r>
-            <w:r>
-              <w:t xml:space="preserve">, affiliations: </w:t>
-            </w:r>
-            <w:r>
-              <w:t>Luxembourg Centre for Contemporary and Digital History (C²DH)</w:t>
-            </w:r>
-            <w:r>
-              <w:t>}</w:t>
-            </w:r>
-          </w:p>
-        </w:tc>
-      </w:tr>
-      <w:tr>
-        <w:trPr>
-          <w:cnfStyle w:val="000000100000" w:firstRow="0" w:lastRow="0" w:firstColumn="0" w:lastColumn="0" w:oddVBand="0" w:evenVBand="0" w:oddHBand="1" w:evenHBand="0" w:firstRowFirstColumn="0" w:firstRowLastColumn="0" w:lastRowFirstColumn="0" w:lastRowLastColumn="0"/>
-        </w:trPr>
-        <w:tc>
-          <w:tcPr>
-            <w:cnfStyle w:val="001000000000" w:firstRow="0" w:lastRow="0" w:firstColumn="1" w:lastColumn="0" w:oddVBand="0" w:evenVBand="0" w:oddHBand="0" w:evenHBand="0" w:firstRowFirstColumn="0" w:firstRowLastColumn="0" w:lastRowFirstColumn="0" w:lastRowLastColumn="0"/>
-            <w:tcW w:w="1523" w:type="dxa"/>
-          </w:tcPr>
-          <w:p>
-            <w:pPr>
-              <w:pStyle w:val="Frontmatter"/>
-            </w:pPr>
-            <w:r>
-              <w:t>_</w:t>
-            </w:r>
-            <w:proofErr w:type="spellStart"/>
-            <w:r>
-              <w:t>isbn</w:t>
-            </w:r>
-            <w:proofErr w:type="spellEnd"/>
-          </w:p>
-        </w:tc>
-        <w:tc>
-          <w:tcPr>
-            <w:tcW w:w="7719" w:type="dxa"/>
-          </w:tcPr>
-          <w:p>
-            <w:pPr>
-              <w:pStyle w:val="Frontmatter"/>
-              <w:cnfStyle w:val="000000100000" w:firstRow="0" w:lastRow="0" w:firstColumn="0" w:lastColumn="0" w:oddVBand="0" w:evenVBand="0" w:oddHBand="1" w:evenHBand="0" w:firstRowFirstColumn="0" w:firstRowLastColumn="0" w:lastRowFirstColumn="0" w:lastRowLastColumn="0"/>
-            </w:pPr>
-            <w:r>
-              <w:t>{</w:t>
-            </w:r>
-            <w:proofErr w:type="spellStart"/>
-            <w:r>
-              <w:t>ebook</w:t>
-            </w:r>
-            <w:proofErr w:type="spellEnd"/>
-            <w:r>
-              <w:t>: 9876543210123, hardcover: 9876543210123, paperback: 9876543210123}</w:t>
-            </w:r>
-          </w:p>
-        </w:tc>
-      </w:tr>
-      <w:tr>
-        <w:tc>
-          <w:tcPr>
-            <w:cnfStyle w:val="001000000000" w:firstRow="0" w:lastRow="0" w:firstColumn="1" w:lastColumn="0" w:oddVBand="0" w:evenVBand="0" w:oddHBand="0" w:evenHBand="0" w:firstRowFirstColumn="0" w:firstRowLastColumn="0" w:lastRowFirstColumn="0" w:lastRowLastColumn="0"/>
-            <w:tcW w:w="1523" w:type="dxa"/>
-          </w:tcPr>
-          <w:p>
-            <w:pPr>
-              <w:pStyle w:val="Frontmatter"/>
-            </w:pPr>
-            <w:r>
-              <w:t>K</w:t>
-            </w:r>
-            <w:r>
-              <w:t>eywords</w:t>
-            </w:r>
-          </w:p>
-        </w:tc>
-        <w:tc>
-          <w:tcPr>
-            <w:tcW w:w="7719" w:type="dxa"/>
-          </w:tcPr>
-          <w:p>
-            <w:pPr>
-              <w:pStyle w:val="Frontmatter"/>
-              <w:numPr>
-                <w:ilvl w:val="0"/>
-                <w:numId w:val="3"/>
-              </w:numPr>
-              <w:cnfStyle w:val="000000000000" w:firstRow="0" w:lastRow="0" w:firstColumn="0" w:lastColumn="0" w:oddVBand="0" w:evenVBand="0" w:oddHBand="0" w:evenHBand="0" w:firstRowFirstColumn="0" w:firstRowLastColumn="0" w:lastRowFirstColumn="0" w:lastRowLastColumn="0"/>
-            </w:pPr>
-            <w:r>
-              <w:t>test</w:t>
-            </w:r>
-          </w:p>
-          <w:p>
-            <w:pPr>
-              <w:pStyle w:val="Frontmatter"/>
-              <w:numPr>
-                <w:ilvl w:val="0"/>
-                <w:numId w:val="3"/>
-              </w:numPr>
-              <w:cnfStyle w:val="000000000000" w:firstRow="0" w:lastRow="0" w:firstColumn="0" w:lastColumn="0" w:oddVBand="0" w:evenVBand="0" w:oddHBand="0" w:evenHBand="0" w:firstRowFirstColumn="0" w:firstRowLastColumn="0" w:lastRowFirstColumn="0" w:lastRowLastColumn="0"/>
-            </w:pPr>
-            <w:r>
-              <w:t>e2e</w:t>
-            </w:r>
-          </w:p>
-        </w:tc>
-      </w:tr>
-      <w:tr>
-        <w:trPr>
-          <w:cnfStyle w:val="000000100000" w:firstRow="0" w:lastRow="0" w:firstColumn="0" w:lastColumn="0" w:oddVBand="0" w:evenVBand="0" w:oddHBand="1" w:evenHBand="0" w:firstRowFirstColumn="0" w:firstRowLastColumn="0" w:lastRowFirstColumn="0" w:lastRowLastColumn="0"/>
-        </w:trPr>
-        <w:tc>
-          <w:tcPr>
-            <w:cnfStyle w:val="001000000000" w:firstRow="0" w:lastRow="0" w:firstColumn="1" w:lastColumn="0" w:oddVBand="0" w:evenVBand="0" w:oddHBand="0" w:evenHBand="0" w:firstRowFirstColumn="0" w:firstRowLastColumn="0" w:lastRowFirstColumn="0" w:lastRowLastColumn="0"/>
-            <w:tcW w:w="1523" w:type="dxa"/>
-          </w:tcPr>
-          <w:p>
-            <w:pPr>
-              <w:pStyle w:val="Frontmatter"/>
-            </w:pPr>
-            <w:proofErr w:type="spellStart"/>
-            <w:r>
-              <w:t>open_access</w:t>
-            </w:r>
-            <w:proofErr w:type="spellEnd"/>
-          </w:p>
-        </w:tc>
-        <w:tc>
-          <w:tcPr>
-            <w:tcW w:w="7719" w:type="dxa"/>
-          </w:tcPr>
-          <w:p>
-            <w:pPr>
-              <w:pStyle w:val="Frontmatter"/>
-              <w:cnfStyle w:val="000000100000" w:firstRow="0" w:lastRow="0" w:firstColumn="0" w:lastColumn="0" w:oddVBand="0" w:evenVBand="0" w:oddHBand="1" w:evenHBand="0" w:firstRowFirstColumn="0" w:firstRowLastColumn="0" w:lastRowFirstColumn="0" w:lastRowLastColumn="0"/>
-            </w:pPr>
-            <w:r>
-              <w:t>True</w:t>
-            </w:r>
-          </w:p>
-        </w:tc>
-      </w:tr>
-      <w:tr>
-        <w:tc>
-          <w:tcPr>
-            <w:cnfStyle w:val="001000000000" w:firstRow="0" w:lastRow="0" w:firstColumn="1" w:lastColumn="0" w:oddVBand="0" w:evenVBand="0" w:oddHBand="0" w:evenHBand="0" w:firstRowFirstColumn="0" w:firstRowLastColumn="0" w:lastRowFirstColumn="0" w:lastRowLastColumn="0"/>
-            <w:tcW w:w="1523" w:type="dxa"/>
-          </w:tcPr>
-          <w:p>
-            <w:pPr>
-              <w:pStyle w:val="Frontmatter"/>
-            </w:pPr>
-            <w:r>
-              <w:t>L</w:t>
-            </w:r>
-            <w:r>
-              <w:t>icense</w:t>
-            </w:r>
-          </w:p>
-        </w:tc>
-        <w:tc>
-          <w:tcPr>
-            <w:tcW w:w="7719" w:type="dxa"/>
-          </w:tcPr>
-          <w:p>
-            <w:pPr>
-              <w:pStyle w:val="Frontmatter"/>
-              <w:cnfStyle w:val="000000000000" w:firstRow="0" w:lastRow="0" w:firstColumn="0" w:lastColumn="0" w:oddVBand="0" w:evenVBand="0" w:oddHBand="0" w:evenHBand="0" w:firstRowFirstColumn="0" w:firstRowLastColumn="0" w:lastRowFirstColumn="0" w:lastRowLastColumn="0"/>
-            </w:pPr>
-            <w:r>
-              <w:t>CC-BY-NC-ND-4.0</w:t>
-            </w:r>
-          </w:p>
-        </w:tc>
-      </w:tr>
-      <w:tr>
-        <w:trPr>
-          <w:cnfStyle w:val="000000100000" w:firstRow="0" w:lastRow="0" w:firstColumn="0" w:lastColumn="0" w:oddVBand="0" w:evenVBand="0" w:oddHBand="1" w:evenHBand="0" w:firstRowFirstColumn="0" w:firstRowLastColumn="0" w:lastRowFirstColumn="0" w:lastRowLastColumn="0"/>
-        </w:trPr>
-        <w:tc>
-          <w:tcPr>
-            <w:cnfStyle w:val="001000000000" w:firstRow="0" w:lastRow="0" w:firstColumn="1" w:lastColumn="0" w:oddVBand="0" w:evenVBand="0" w:oddHBand="0" w:evenHBand="0" w:firstRowFirstColumn="0" w:firstRowLastColumn="0" w:lastRowFirstColumn="0" w:lastRowLastColumn="0"/>
-            <w:tcW w:w="1523" w:type="dxa"/>
-          </w:tcPr>
-          <w:p>
-            <w:pPr>
-              <w:pStyle w:val="Frontmatter"/>
-            </w:pPr>
-            <w:proofErr w:type="spellStart"/>
-            <w:r>
-              <w:t>G</w:t>
-            </w:r>
-            <w:r>
-              <w:t>ithub</w:t>
-            </w:r>
-            <w:proofErr w:type="spellEnd"/>
-          </w:p>
-        </w:tc>
-        <w:tc>
-          <w:tcPr>
-            <w:tcW w:w="7719" w:type="dxa"/>
-          </w:tcPr>
-          <w:p>
-            <w:pPr>
-              <w:pStyle w:val="Frontmatter"/>
-              <w:cnfStyle w:val="000000100000" w:firstRow="0" w:lastRow="0" w:firstColumn="0" w:lastColumn="0" w:oddVBand="0" w:evenVBand="0" w:oddHBand="1" w:evenHBand="0" w:firstRowFirstColumn="0" w:firstRowLastColumn="0" w:lastRowFirstColumn="0" w:lastRowLastColumn="0"/>
-            </w:pPr>
-            <w:hyperlink r:id="rId8" w:history="1">
-              <w:r>
-                <w:rPr>
-                  <w:rStyle w:val="Hyperlink"/>
-                </w:rPr>
-                <w:t xml:space="preserve">https://github.com/monograph-prototypes/split-to-multiple-chapters </w:t>
-              </w:r>
-            </w:hyperlink>
-          </w:p>
-        </w:tc>
-      </w:tr>
-      <w:tr>
-        <w:tc>
-          <w:tcPr>
-            <w:cnfStyle w:val="001000000000" w:firstRow="0" w:lastRow="0" w:firstColumn="1" w:lastColumn="0" w:oddVBand="0" w:evenVBand="0" w:oddHBand="0" w:evenHBand="0" w:firstRowFirstColumn="0" w:firstRowLastColumn="0" w:lastRowFirstColumn="0" w:lastRowLastColumn="0"/>
-            <w:tcW w:w="1523" w:type="dxa"/>
-          </w:tcPr>
-          <w:p>
-            <w:pPr>
-              <w:pStyle w:val="Frontmatter"/>
-            </w:pPr>
-            <w:r>
-              <w:t>_</w:t>
-            </w:r>
-            <w:r>
-              <w:t>split</w:t>
-            </w:r>
-          </w:p>
-        </w:tc>
-        <w:tc>
-          <w:tcPr>
-            <w:tcW w:w="7719" w:type="dxa"/>
-          </w:tcPr>
-          <w:p>
-            <w:pPr>
-              <w:pStyle w:val="Frontmatter"/>
-              <w:cnfStyle w:val="000000000000" w:firstRow="0" w:lastRow="0" w:firstColumn="0" w:lastColumn="0" w:oddVBand="0" w:evenVBand="0" w:oddHBand="0" w:evenHBand="0" w:firstRowFirstColumn="0" w:firstRowLastColumn="0" w:lastRowFirstColumn="0" w:lastRowLastColumn="0"/>
-            </w:pPr>
-            <w:r>
-              <w:t>true</w:t>
-            </w:r>
-          </w:p>
-        </w:tc>
-      </w:tr>
-      <w:tr>
-        <w:trPr>
-          <w:cnfStyle w:val="000000100000" w:firstRow="0" w:lastRow="0" w:firstColumn="0" w:lastColumn="0" w:oddVBand="0" w:evenVBand="0" w:oddHBand="1" w:evenHBand="0" w:firstRowFirstColumn="0" w:firstRowLastColumn="0" w:lastRowFirstColumn="0" w:lastRowLastColumn="0"/>
-        </w:trPr>
-        <w:tc>
-          <w:tcPr>
-            <w:cnfStyle w:val="001000000000" w:firstRow="0" w:lastRow="0" w:firstColumn="1" w:lastColumn="0" w:oddVBand="0" w:evenVBand="0" w:oddHBand="0" w:evenHBand="0" w:firstRowFirstColumn="0" w:firstRowLastColumn="0" w:lastRowFirstColumn="0" w:lastRowLastColumn="0"/>
-            <w:tcW w:w="1523" w:type="dxa"/>
-          </w:tcPr>
-          <w:p>
-            <w:pPr>
-              <w:pStyle w:val="Frontmatter"/>
-            </w:pPr>
-            <w:r>
               <w:t>_</w:t>
             </w:r>
             <w:r>
@@ -412,7 +107,7 @@
                 <w:ilvl w:val="0"/>
                 <w:numId w:val="5"/>
               </w:numPr>
-              <w:cnfStyle w:val="000000100000" w:firstRow="0" w:lastRow="0" w:firstColumn="0" w:lastColumn="0" w:oddVBand="0" w:evenVBand="0" w:oddHBand="1" w:evenHBand="0" w:firstRowFirstColumn="0" w:firstRowLastColumn="0" w:lastRowFirstColumn="0" w:lastRowLastColumn="0"/>
+              <w:cnfStyle w:val="000000000000" w:firstRow="0" w:lastRow="0" w:firstColumn="0" w:lastColumn="0" w:oddVBand="0" w:evenVBand="0" w:oddHBand="0" w:evenHBand="0" w:firstRowFirstColumn="0" w:firstRowLastColumn="0" w:lastRowFirstColumn="0" w:lastRowLastColumn="0"/>
             </w:pPr>
             <w:r>
               <w:t>{bookmark: h1_index, slug: index, prefix: I</w:t>
@@ -440,7 +135,7 @@
                 <w:ilvl w:val="0"/>
                 <w:numId w:val="5"/>
               </w:numPr>
-              <w:cnfStyle w:val="000000100000" w:firstRow="0" w:lastRow="0" w:firstColumn="0" w:lastColumn="0" w:oddVBand="0" w:evenVBand="0" w:oddHBand="1" w:evenHBand="0" w:firstRowFirstColumn="0" w:firstRowLastColumn="0" w:lastRowFirstColumn="0" w:lastRowLastColumn="0"/>
+              <w:cnfStyle w:val="000000000000" w:firstRow="0" w:lastRow="0" w:firstColumn="0" w:lastColumn="0" w:oddVBand="0" w:evenVBand="0" w:oddHBand="0" w:evenHBand="0" w:firstRowFirstColumn="0" w:firstRowLastColumn="0" w:lastRowFirstColumn="0" w:lastRowLastColumn="0"/>
             </w:pPr>
             <w:r>
               <w:t>{bookmark: h1_infile, slug: in-file, prefix: 1</w:t>
@@ -454,10 +149,7 @@
             </w:r>
             <w:proofErr w:type="spellEnd"/>
             <w:r>
-              <w:t>: 0</w:t>
-            </w:r>
-            <w:r>
-              <w:t>1_infile</w:t>
+              <w:t>: 01_infile</w:t>
             </w:r>
             <w:r>
               <w:t>}</w:t>
@@ -470,131 +162,54 @@
                 <w:ilvl w:val="0"/>
                 <w:numId w:val="5"/>
               </w:numPr>
-              <w:cnfStyle w:val="000000100000" w:firstRow="0" w:lastRow="0" w:firstColumn="0" w:lastColumn="0" w:oddVBand="0" w:evenVBand="0" w:oddHBand="1" w:evenHBand="0" w:firstRowFirstColumn="0" w:firstRowLastColumn="0" w:lastRowFirstColumn="0" w:lastRowLastColumn="0"/>
-            </w:pPr>
-            <w:r>
-              <w:t>{bookmark: h1_isunicode</w:t>
-            </w:r>
-            <w:r>
-              <w:t xml:space="preserve">, </w:t>
-            </w:r>
-            <w:r>
-              <w:t>slug: is-</w:t>
-            </w:r>
-            <w:proofErr w:type="spellStart"/>
-            <w:r>
-              <w:t>unicode</w:t>
-            </w:r>
-            <w:proofErr w:type="spellEnd"/>
-            <w:r>
-              <w:t>-handled-well</w:t>
-            </w:r>
-            <w:r>
-              <w:t xml:space="preserve">, </w:t>
-            </w:r>
-            <w:r>
-              <w:t>prefix: 2</w:t>
-            </w:r>
-            <w:r>
-              <w:t xml:space="preserve">, </w:t>
-            </w:r>
-            <w:proofErr w:type="spellStart"/>
-            <w:r>
-              <w:t>fn</w:t>
-            </w:r>
-            <w:proofErr w:type="spellEnd"/>
-            <w:r>
-              <w:t xml:space="preserve">: </w:t>
-            </w:r>
-            <w:r>
-              <w:t>02_</w:t>
-            </w:r>
-            <w:r>
-              <w:t>is_unicode_with_custom</w:t>
-            </w:r>
-            <w:r>
-              <w:t>_file_name</w:t>
-            </w:r>
-            <w:r>
-              <w:t>}</w:t>
-            </w:r>
-          </w:p>
-        </w:tc>
-      </w:tr>
-      <w:tr>
-        <w:tc>
-          <w:tcPr>
-            <w:cnfStyle w:val="001000000000" w:firstRow="0" w:lastRow="0" w:firstColumn="1" w:lastColumn="0" w:oddVBand="0" w:evenVBand="0" w:oddHBand="0" w:evenHBand="0" w:firstRowFirstColumn="0" w:firstRowLastColumn="0" w:lastRowFirstColumn="0" w:lastRowLastColumn="0"/>
-            <w:tcW w:w="1523" w:type="dxa"/>
-          </w:tcPr>
-          <w:p>
-            <w:pPr>
-              <w:pStyle w:val="Frontmatter"/>
-            </w:pPr>
-            <w:r>
-              <w:t>T</w:t>
-            </w:r>
-            <w:r>
-              <w:t>humbnail</w:t>
-            </w:r>
-          </w:p>
-        </w:tc>
-        <w:tc>
-          <w:tcPr>
-            <w:tcW w:w="7719" w:type="dxa"/>
-          </w:tcPr>
-          <w:p>
-            <w:pPr>
-              <w:pStyle w:val="Frontmatter"/>
               <w:cnfStyle w:val="000000000000" w:firstRow="0" w:lastRow="0" w:firstColumn="0" w:lastColumn="0" w:oddVBand="0" w:evenVBand="0" w:oddHBand="0" w:evenHBand="0" w:firstRowFirstColumn="0" w:firstRowLastColumn="0" w:lastRowFirstColumn="0" w:lastRowLastColumn="0"/>
             </w:pPr>
             <w:r>
-              <w:t>./assets/</w:t>
-            </w:r>
-            <w:r>
-              <w:t>banner.jpeg</w:t>
-            </w:r>
-          </w:p>
-        </w:tc>
-      </w:tr>
-      <w:tr>
-        <w:trPr>
-          <w:cnfStyle w:val="000000100000" w:firstRow="0" w:lastRow="0" w:firstColumn="0" w:lastColumn="0" w:oddVBand="0" w:evenVBand="0" w:oddHBand="1" w:evenHBand="0" w:firstRowFirstColumn="0" w:firstRowLastColumn="0" w:lastRowFirstColumn="0" w:lastRowLastColumn="0"/>
-        </w:trPr>
-        <w:tc>
-          <w:tcPr>
-            <w:cnfStyle w:val="001000000000" w:firstRow="0" w:lastRow="0" w:firstColumn="1" w:lastColumn="0" w:oddVBand="0" w:evenVBand="0" w:oddHBand="0" w:evenHBand="0" w:firstRowFirstColumn="0" w:firstRowLastColumn="0" w:lastRowFirstColumn="0" w:lastRowLastColumn="0"/>
-            <w:tcW w:w="1523" w:type="dxa"/>
-          </w:tcPr>
-          <w:p>
-            <w:pPr>
-              <w:pStyle w:val="Frontmatter"/>
-            </w:pPr>
-            <w:r>
-              <w:t>B</w:t>
-            </w:r>
-            <w:r>
-              <w:t>anner</w:t>
-            </w:r>
-          </w:p>
-        </w:tc>
-        <w:tc>
-          <w:tcPr>
-            <w:tcW w:w="7719" w:type="dxa"/>
-          </w:tcPr>
-          <w:p>
-            <w:pPr>
-              <w:pStyle w:val="Frontmatter"/>
-              <w:cnfStyle w:val="000000100000" w:firstRow="0" w:lastRow="0" w:firstColumn="0" w:lastColumn="0" w:oddVBand="0" w:evenVBand="0" w:oddHBand="1" w:evenHBand="0" w:firstRowFirstColumn="0" w:firstRowLastColumn="0" w:lastRowFirstColumn="0" w:lastRowLastColumn="0"/>
-            </w:pPr>
-            <w:r>
-              <w:t>./assets/</w:t>
+              <w:t>{bookmark: h1_isunicode</w:t>
+            </w:r>
+            <w:r>
+              <w:t xml:space="preserve">, </w:t>
+            </w:r>
+            <w:r>
+              <w:t>slug: is-</w:t>
             </w:r>
             <w:proofErr w:type="spellStart"/>
             <w:r>
-              <w:t>thumbnail.svg</w:t>
+              <w:t>unicode</w:t>
             </w:r>
             <w:proofErr w:type="spellEnd"/>
+            <w:r>
+              <w:t>-handled-well</w:t>
+            </w:r>
+            <w:r>
+              <w:t xml:space="preserve">, </w:t>
+            </w:r>
+            <w:r>
+              <w:t>prefix: 2</w:t>
+            </w:r>
+            <w:r>
+              <w:t xml:space="preserve">, </w:t>
+            </w:r>
+            <w:proofErr w:type="spellStart"/>
+            <w:r>
+              <w:t>fn</w:t>
+            </w:r>
+            <w:proofErr w:type="spellEnd"/>
+            <w:r>
+              <w:t xml:space="preserve">: </w:t>
+            </w:r>
+            <w:r>
+              <w:t>02_</w:t>
+            </w:r>
+            <w:r>
+              <w:t>is_unicode_with_custom</w:t>
+            </w:r>
+            <w:r>
+              <w:t>_file_name</w:t>
+            </w:r>
+            <w:r>
+              <w:t>}</w:t>
+            </w:r>
           </w:p>
         </w:tc>
       </w:tr>
@@ -847,7 +462,7 @@
                     </pic:cNvPicPr>
                   </pic:nvPicPr>
                   <pic:blipFill>
-                    <a:blip r:embed="rId9">
+                    <a:blip r:embed="rId8">
                       <a:extLst>
                         <a:ext uri="{28A0092B-C50C-407E-A947-70E740481C1C}">
                           <a14:useLocalDpi xmlns:a14="http://schemas.microsoft.com/office/drawing/2010/main" val="0"/>
@@ -983,7 +598,7 @@
         </w:rPr>
         <w:t xml:space="preserve">a </w:t>
       </w:r>
-      <w:hyperlink r:id="rId10" w:history="1">
+      <w:hyperlink r:id="rId9" w:history="1">
         <w:r>
           <w:rPr>
             <w:rStyle w:val="Hyperlink"/>
@@ -1000,7 +615,7 @@
         </w:rPr>
         <w:t xml:space="preserve"> and </w:t>
       </w:r>
-      <w:hyperlink r:id="rId11" w:anchor="tbl_aSimpleTable" w:history="1">
+      <w:hyperlink r:id="rId10" w:anchor="tbl_aSimpleTable" w:history="1">
         <w:r>
           <w:rPr>
             <w:rStyle w:val="Hyperlink"/>
@@ -1163,7 +778,7 @@
       <w:r>
         <w:t xml:space="preserve">Also, see a </w:t>
       </w:r>
-      <w:hyperlink r:id="rId12" w:anchor="tbl_aSimpleTable" w:history="1">
+      <w:hyperlink r:id="rId11" w:anchor="tbl_aSimpleTable" w:history="1">
         <w:r>
           <w:rPr>
             <w:rStyle w:val="Hyperlink"/>
@@ -1463,7 +1078,6 @@
         <w:pStyle w:val="Heading2"/>
       </w:pPr>
       <w:r>
-        <w:lastRenderedPageBreak/>
         <w:t>In-file ref</w:t>
       </w:r>
       <w:r>
@@ -1652,6 +1266,7 @@
         <w:jc w:val="both"/>
       </w:pPr>
       <w:r>
+        <w:lastRenderedPageBreak/>
         <w:t xml:space="preserve">Link to </w:t>
       </w:r>
       <w:r>
@@ -2036,7 +1651,7 @@
       <w:r>
         <w:pict w14:anchorId="5EE2F14B">
           <v:shape id="_x0000_i1026" type="#_x0000_t75" alt="The&#10;&#10;Alt&#10;&#10;Text" style="width:7.5pt;height:7.5pt;visibility:visible;mso-wrap-style:square">
-            <v:imagedata r:id="rId13" o:title="The&#10;&#10;Alt&#10;&#10;Text"/>
+            <v:imagedata r:id="rId12" o:title="The&#10;&#10;Alt&#10;&#10;Text"/>
           </v:shape>
         </w:pict>
       </w:r>
@@ -2061,7 +1676,7 @@
         </w:rPr>
         <w:t xml:space="preserve">a </w:t>
       </w:r>
-      <w:hyperlink r:id="rId14" w:history="1">
+      <w:hyperlink r:id="rId13" w:history="1">
         <w:r>
           <w:rPr>
             <w:rStyle w:val="Hyperlink"/>
@@ -2228,7 +1843,7 @@
                     </pic:cNvPicPr>
                   </pic:nvPicPr>
                   <pic:blipFill>
-                    <a:blip r:embed="rId9">
+                    <a:blip r:embed="rId8">
                       <a:extLst>
                         <a:ext uri="{28A0092B-C50C-407E-A947-70E740481C1C}">
                           <a14:useLocalDpi xmlns:a14="http://schemas.microsoft.com/office/drawing/2010/main" val="0"/>
@@ -2735,7 +2350,7 @@
         <v:path o:extrusionok="f" gradientshapeok="t" o:connecttype="rect"/>
         <o:lock v:ext="edit" aspectratio="t"/>
       </v:shapetype>
-      <v:shape id="_x0000_i1027" type="#_x0000_t75" alt="The&#10;&#10;Alt&#10;&#10;Text" style="width:7.5pt;height:7.5pt;visibility:visible;mso-wrap-style:square" o:bullet="t">
+      <v:shape id="_x0000_i1026" type="#_x0000_t75" alt="The&#10;&#10;Alt&#10;&#10;Text" style="width:7.5pt;height:7.5pt;visibility:visible;mso-wrap-style:square" o:bullet="t">
         <v:imagedata r:id="rId1" o:title="The&#10;&#10;Alt&#10;&#10;Text"/>
       </v:shape>
     </w:pict>

</xml_diff>

<commit_message>
Test autonumbering in split to multiple documents example [skip-ci]
</commit_message>
<xml_diff>
--- a/tests/_fixtures/split-to-multiple-chapters/manuscript.docx
+++ b/tests/_fixtures/split-to-multiple-chapters/manuscript.docx
@@ -567,7 +567,7 @@
           <w:i w:val="0"/>
           <w:iCs/>
         </w:rPr>
-        <w:t>.</w:t>
+        <w:t>:</w:t>
       </w:r>
       <w:r>
         <w:rPr>
@@ -813,7 +813,9 @@
           <w:iCs/>
         </w:rPr>
       </w:pPr>
-      <w:bookmarkStart w:id="7" w:name="equationWithComplexNumbering"/>
+      <w:bookmarkStart w:id="7" w:name="_Ref215839118"/>
+      <w:bookmarkStart w:id="8" w:name="_Ref215839106"/>
+      <w:bookmarkStart w:id="9" w:name="equationWithComplexNumbering"/>
       <w:r>
         <w:rPr>
           <w:b/>
@@ -839,7 +841,7 @@
           <w:i w:val="0"/>
           <w:iCs/>
         </w:rPr>
-        <w:instrText xml:space="preserve"> STYLEREF 2 \s </w:instrText>
+        <w:instrText xml:space="preserve"> STYLEREF 1 \s </w:instrText>
       </w:r>
       <w:r>
         <w:rPr>
@@ -858,7 +860,7 @@
           <w:iCs/>
           <w:noProof/>
         </w:rPr>
-        <w:t>2.1</w:t>
+        <w:t>2</w:t>
       </w:r>
       <w:r>
         <w:rPr>
@@ -894,7 +896,7 @@
           <w:i w:val="0"/>
           <w:iCs/>
         </w:rPr>
-        <w:instrText xml:space="preserve"> SEQ Equation \* ARABIC \s 2 </w:instrText>
+        <w:instrText xml:space="preserve"> SEQ Equation \* ALPHABETIC \s 1 </w:instrText>
       </w:r>
       <w:r>
         <w:rPr>
@@ -913,7 +915,7 @@
           <w:iCs/>
           <w:noProof/>
         </w:rPr>
-        <w:t>1</w:t>
+        <w:t>A</w:t>
       </w:r>
       <w:r>
         <w:rPr>
@@ -924,6 +926,7 @@
         </w:rPr>
         <w:fldChar w:fldCharType="end"/>
       </w:r>
+      <w:bookmarkEnd w:id="7"/>
       <w:r>
         <w:rPr>
           <w:b/>
@@ -938,38 +941,20 @@
           <w:i w:val="0"/>
           <w:iCs/>
         </w:rPr>
-        <w:t xml:space="preserve"> Caption with </w:t>
-      </w:r>
-      <w:r>
-        <w:rPr>
-          <w:i w:val="0"/>
-          <w:iCs/>
-        </w:rPr>
-        <w:t>heading 1</w:t>
-      </w:r>
-      <w:r>
-        <w:rPr>
-          <w:i w:val="0"/>
-          <w:iCs/>
-        </w:rPr>
         <w:t xml:space="preserve"> </w:t>
       </w:r>
-      <w:r>
-        <w:rPr>
-          <w:i w:val="0"/>
-          <w:iCs/>
-        </w:rPr>
-        <w:t xml:space="preserve">and heading 2 </w:t>
-      </w:r>
-      <w:r>
-        <w:rPr>
-          <w:i w:val="0"/>
-          <w:iCs/>
-        </w:rPr>
-        <w:t>number.</w:t>
-      </w:r>
+      <w:bookmarkStart w:id="10" w:name="_Ref215839114"/>
+      <w:r>
+        <w:rPr>
+          <w:i w:val="0"/>
+          <w:iCs/>
+        </w:rPr>
+        <w:t>Caption with heading 1 and heading 2 number.</w:t>
+      </w:r>
+      <w:bookmarkEnd w:id="8"/>
+      <w:bookmarkEnd w:id="10"/>
     </w:p>
-    <w:bookmarkEnd w:id="7"/>
+    <w:bookmarkEnd w:id="9"/>
     <w:p>
       <w:pPr>
         <w:pStyle w:val="BodyText"/>
@@ -1219,6 +1204,9 @@
       <w:r>
         <w:t xml:space="preserve">Complex numbering: </w:t>
       </w:r>
+      <w:r>
+        <w:t xml:space="preserve">via bookmark </w:t>
+      </w:r>
       <w:hyperlink w:anchor="equationWithComplexNumbering" w:history="1">
         <w:r>
           <w:rPr>
@@ -1228,6 +1216,53 @@
         </w:r>
       </w:hyperlink>
       <w:r>
+        <w:t xml:space="preserve"> and cross-ref </w:t>
+      </w:r>
+      <w:r>
+        <w:t xml:space="preserve">to </w:t>
+      </w:r>
+      <w:r>
+        <w:fldChar w:fldCharType="begin"/>
+      </w:r>
+      <w:r>
+        <w:instrText xml:space="preserve"> REF _Ref215839118 \h </w:instrText>
+      </w:r>
+      <w:r>
+        <w:instrText xml:space="preserve"> \* MERGEFORMAT </w:instrText>
+      </w:r>
+      <w:r>
+        <w:fldChar w:fldCharType="separate"/>
+      </w:r>
+      <w:r>
+        <w:rPr>
+          <w:iCs/>
+        </w:rPr>
+        <w:t xml:space="preserve">Equation </w:t>
+      </w:r>
+      <w:r>
+        <w:rPr>
+          <w:iCs/>
+          <w:noProof/>
+        </w:rPr>
+        <w:t>2</w:t>
+      </w:r>
+      <w:r>
+        <w:rPr>
+          <w:iCs/>
+        </w:rPr>
+        <w:t>.</w:t>
+      </w:r>
+      <w:r>
+        <w:rPr>
+          <w:iCs/>
+          <w:noProof/>
+        </w:rPr>
+        <w:t>A</w:t>
+      </w:r>
+      <w:r>
+        <w:fldChar w:fldCharType="end"/>
+      </w:r>
+      <w:r>
         <w:t>.</w:t>
       </w:r>
     </w:p>
@@ -1414,7 +1449,7 @@
       <w:pPr>
         <w:pStyle w:val="Heading1"/>
       </w:pPr>
-      <w:bookmarkStart w:id="8" w:name="h1_isunicode"/>
+      <w:bookmarkStart w:id="11" w:name="h1_isunicode"/>
       <w:r>
         <w:t>Second chapter</w:t>
       </w:r>
@@ -1468,7 +1503,7 @@
         <w:t>?</w:t>
       </w:r>
     </w:p>
-    <w:bookmarkEnd w:id="8"/>
+    <w:bookmarkEnd w:id="11"/>
     <w:p>
       <w:pPr>
         <w:pStyle w:val="Heading2"/>
@@ -1566,7 +1601,7 @@
           <w:lang w:val="en-GB"/>
         </w:rPr>
       </w:pPr>
-      <w:bookmarkStart w:id="9" w:name="_Ref208242831"/>
+      <w:bookmarkStart w:id="12" w:name="_Ref208242831"/>
       <w:r>
         <w:rPr>
           <w:b/>
@@ -1622,7 +1657,7 @@
         </w:rPr>
         <w:fldChar w:fldCharType="end"/>
       </w:r>
-      <w:bookmarkEnd w:id="9"/>
+      <w:bookmarkEnd w:id="12"/>
       <w:r>
         <w:rPr>
           <w:b/>
@@ -1705,16 +1740,16 @@
       <w:pPr>
         <w:pStyle w:val="Heading2"/>
       </w:pPr>
-      <w:bookmarkStart w:id="10" w:name="_Targets_for_file"/>
-      <w:bookmarkStart w:id="11" w:name="targets_for_f2f"/>
-      <w:bookmarkEnd w:id="10"/>
+      <w:bookmarkStart w:id="13" w:name="_Targets_for_file"/>
+      <w:bookmarkStart w:id="14" w:name="targets_for_f2f"/>
+      <w:bookmarkEnd w:id="13"/>
       <w:r>
         <w:t>Targets for file to file</w:t>
       </w:r>
       <w:r>
         <w:t xml:space="preserve"> relationships</w:t>
       </w:r>
-      <w:bookmarkEnd w:id="11"/>
+      <w:bookmarkEnd w:id="14"/>
     </w:p>
     <w:p>
       <w:pPr>
@@ -1740,8 +1775,8 @@
           <w:lang w:val="en-GB"/>
         </w:rPr>
       </w:pPr>
-      <w:bookmarkStart w:id="12" w:name="_Ref208241466"/>
-      <w:bookmarkStart w:id="13" w:name="_Ref208241461"/>
+      <w:bookmarkStart w:id="15" w:name="_Ref208241466"/>
+      <w:bookmarkStart w:id="16" w:name="_Ref208241461"/>
       <w:r>
         <w:rPr>
           <w:b/>
@@ -1797,7 +1832,7 @@
         </w:rPr>
         <w:fldChar w:fldCharType="end"/>
       </w:r>
-      <w:bookmarkEnd w:id="12"/>
+      <w:bookmarkEnd w:id="15"/>
       <w:r>
         <w:rPr>
           <w:b/>
@@ -1814,7 +1849,7 @@
         </w:rPr>
         <w:t xml:space="preserve"> Image in second chapter.</w:t>
       </w:r>
-      <w:bookmarkEnd w:id="13"/>
+      <w:bookmarkEnd w:id="16"/>
     </w:p>
     <w:p>
       <w:pPr>
@@ -1901,8 +1936,8 @@
           <w:iCs/>
         </w:rPr>
       </w:pPr>
-      <w:bookmarkStart w:id="14" w:name="_Ref208241479"/>
-      <w:bookmarkStart w:id="15" w:name="tbl_aSimpleTable"/>
+      <w:bookmarkStart w:id="17" w:name="_Ref208241479"/>
+      <w:bookmarkStart w:id="18" w:name="tbl_aSimpleTable"/>
       <w:r>
         <w:rPr>
           <w:b/>
@@ -1958,7 +1993,7 @@
         </w:rPr>
         <w:fldChar w:fldCharType="end"/>
       </w:r>
-      <w:bookmarkEnd w:id="14"/>
+      <w:bookmarkEnd w:id="17"/>
       <w:r>
         <w:rPr>
           <w:b/>
@@ -1992,7 +2027,7 @@
           <w:tcPr>
             <w:tcW w:w="3080" w:type="dxa"/>
           </w:tcPr>
-          <w:bookmarkEnd w:id="15"/>
+          <w:bookmarkEnd w:id="18"/>
           <w:p>
             <w:pPr>
               <w:pStyle w:val="BodyText"/>

</xml_diff>

<commit_message>
Add conditional rendering example to test cases
</commit_message>
<xml_diff>
--- a/tests/_fixtures/split-to-multiple-chapters/manuscript.docx
+++ b/tests/_fixtures/split-to-multiple-chapters/manuscript.docx
@@ -413,7 +413,6 @@
           <w:bCs/>
           <w:i w:val="0"/>
           <w:iCs/>
-          <w:noProof/>
         </w:rPr>
         <w:fldChar w:fldCharType="end"/>
       </w:r>
@@ -1444,9 +1443,203 @@
         <w:pStyle w:val="BodyText"/>
         <w:jc w:val="both"/>
       </w:pPr>
+      <w:r>
+        <w:t>C</w:t>
+      </w:r>
+      <w:r>
+        <w:t>onditional rendering</w:t>
+      </w:r>
+      <w:r>
+        <w:t xml:space="preserve">: </w:t>
+      </w:r>
     </w:p>
     <w:p>
       <w:pPr>
+        <w:pStyle w:val="BodyText"/>
+        <w:numPr>
+          <w:ilvl w:val="0"/>
+          <w:numId w:val="6"/>
+        </w:numPr>
+        <w:jc w:val="both"/>
+      </w:pPr>
+      <w:hyperlink r:id="rId12" w:anchor="fig_onlyDigital" w:history="1">
+        <w:r>
+          <w:rPr>
+            <w:rStyle w:val="Hyperlink"/>
+          </w:rPr>
+          <w:t>link to fig [auto] (digital only)</w:t>
+        </w:r>
+      </w:hyperlink>
+      <w:r>
+        <w:t xml:space="preserve">, </w:t>
+      </w:r>
+      <w:hyperlink w:anchor="fig_onlyPaper" w:history="1">
+        <w:r>
+          <w:rPr>
+            <w:rStyle w:val="Hyperlink"/>
+          </w:rPr>
+          <w:t>link to fig [auto] (paper only)</w:t>
+        </w:r>
+      </w:hyperlink>
+      <w:r>
+        <w:t xml:space="preserve"> and </w:t>
+      </w:r>
+      <w:hyperlink w:anchor="fig_bothDigitalAndPaper" w:history="1">
+        <w:r>
+          <w:rPr>
+            <w:rStyle w:val="Hyperlink"/>
+          </w:rPr>
+          <w:t>link to fig [auto] (digital and paper)</w:t>
+        </w:r>
+      </w:hyperlink>
+      <w:r>
+        <w:t>;</w:t>
+      </w:r>
+    </w:p>
+    <w:p>
+      <w:pPr>
+        <w:pStyle w:val="BodyText"/>
+        <w:numPr>
+          <w:ilvl w:val="0"/>
+          <w:numId w:val="6"/>
+        </w:numPr>
+        <w:jc w:val="both"/>
+      </w:pPr>
+      <w:r>
+        <w:t xml:space="preserve">cross-ref </w:t>
+      </w:r>
+      <w:r>
+        <w:t xml:space="preserve">to </w:t>
+      </w:r>
+      <w:r>
+        <w:fldChar w:fldCharType="begin"/>
+      </w:r>
+      <w:r>
+        <w:instrText xml:space="preserve"> REF _Ref216168653 \h </w:instrText>
+      </w:r>
+      <w:r>
+        <w:instrText xml:space="preserve"> \* MERGEFORMAT </w:instrText>
+      </w:r>
+      <w:r>
+        <w:fldChar w:fldCharType="separate"/>
+      </w:r>
+      <w:r>
+        <w:rPr>
+          <w:b/>
+          <w:bCs/>
+          <w:iCs/>
+        </w:rPr>
+        <w:t xml:space="preserve">Figure </w:t>
+      </w:r>
+      <w:r>
+        <w:rPr>
+          <w:b/>
+          <w:bCs/>
+          <w:iCs/>
+          <w:noProof/>
+        </w:rPr>
+        <w:t>4</w:t>
+      </w:r>
+      <w:r>
+        <w:fldChar w:fldCharType="end"/>
+      </w:r>
+      <w:r>
+        <w:t xml:space="preserve"> (</w:t>
+      </w:r>
+      <w:r>
+        <w:t xml:space="preserve">digital only), </w:t>
+      </w:r>
+      <w:r>
+        <w:t xml:space="preserve">cross-ref </w:t>
+      </w:r>
+      <w:r>
+        <w:t xml:space="preserve">to </w:t>
+      </w:r>
+      <w:r>
+        <w:fldChar w:fldCharType="begin"/>
+      </w:r>
+      <w:r>
+        <w:instrText xml:space="preserve"> REF _Ref216168684 \h </w:instrText>
+      </w:r>
+      <w:r>
+        <w:instrText xml:space="preserve"> \* MERGEFORMAT </w:instrText>
+      </w:r>
+      <w:r>
+        <w:fldChar w:fldCharType="separate"/>
+      </w:r>
+      <w:r>
+        <w:rPr>
+          <w:b/>
+          <w:bCs/>
+          <w:iCs/>
+        </w:rPr>
+        <w:t xml:space="preserve">Figure </w:t>
+      </w:r>
+      <w:r>
+        <w:rPr>
+          <w:b/>
+          <w:bCs/>
+          <w:iCs/>
+          <w:noProof/>
+        </w:rPr>
+        <w:t>5</w:t>
+      </w:r>
+      <w:r>
+        <w:fldChar w:fldCharType="end"/>
+      </w:r>
+      <w:r>
+        <w:t xml:space="preserve"> (paper only), </w:t>
+      </w:r>
+      <w:r>
+        <w:t xml:space="preserve">cross-ref </w:t>
+      </w:r>
+      <w:r>
+        <w:t xml:space="preserve">to </w:t>
+      </w:r>
+      <w:r>
+        <w:fldChar w:fldCharType="begin"/>
+      </w:r>
+      <w:r>
+        <w:instrText xml:space="preserve"> REF _Ref216168694 \h </w:instrText>
+      </w:r>
+      <w:r>
+        <w:instrText xml:space="preserve"> \* MERGEFORMAT </w:instrText>
+      </w:r>
+      <w:r>
+        <w:fldChar w:fldCharType="separate"/>
+      </w:r>
+      <w:r>
+        <w:rPr>
+          <w:b/>
+          <w:bCs/>
+          <w:iCs/>
+        </w:rPr>
+        <w:t xml:space="preserve">Figure </w:t>
+      </w:r>
+      <w:r>
+        <w:rPr>
+          <w:b/>
+          <w:bCs/>
+          <w:iCs/>
+          <w:noProof/>
+        </w:rPr>
+        <w:t>6</w:t>
+      </w:r>
+      <w:r>
+        <w:fldChar w:fldCharType="end"/>
+      </w:r>
+      <w:r>
+        <w:t>.</w:t>
+      </w:r>
+    </w:p>
+    <w:p>
+      <w:pPr>
+        <w:pStyle w:val="BodyText"/>
+        <w:jc w:val="both"/>
+      </w:pPr>
+    </w:p>
+    <w:p>
+      <w:pPr>
         <w:pStyle w:val="Heading1"/>
       </w:pPr>
       <w:bookmarkStart w:id="11" w:name="h1_isunicode"/>
@@ -1463,11 +1656,7 @@
         <w:t xml:space="preserve"> </w:t>
       </w:r>
       <w:r>
-        <w:t xml:space="preserve">Is </w:t>
-      </w:r>
-      <w:proofErr w:type="spellStart"/>
-      <w:r>
-        <w:t>Unic</w:t>
+        <w:t>Is Unic</w:t>
       </w:r>
       <w:r>
         <w:rPr>
@@ -1476,15 +1665,7 @@
         <w:t>ǿ</w:t>
       </w:r>
       <w:r>
-        <w:t>de</w:t>
-      </w:r>
-      <w:proofErr w:type="spellEnd"/>
-      <w:r>
-        <w:t xml:space="preserve"> </w:t>
-      </w:r>
-      <w:proofErr w:type="spellStart"/>
-      <w:r>
-        <w:t>h</w:t>
+        <w:t>de h</w:t>
       </w:r>
       <w:r>
         <w:rPr>
@@ -1493,11 +1674,7 @@
         <w:t>ă</w:t>
       </w:r>
       <w:r>
-        <w:t>ndled</w:t>
-      </w:r>
-      <w:proofErr w:type="spellEnd"/>
-      <w:r>
-        <w:t xml:space="preserve"> well</w:t>
+        <w:t>ndled well</w:t>
       </w:r>
       <w:r>
         <w:t>?</w:t>
@@ -1686,7 +1863,7 @@
       <w:r>
         <w:pict w14:anchorId="5EE2F14B">
           <v:shape id="_x0000_i1026" type="#_x0000_t75" alt="The&#10;&#10;Alt&#10;&#10;Text" style="width:7.5pt;height:7.5pt;visibility:visible;mso-wrap-style:square">
-            <v:imagedata r:id="rId12" o:title="The&#10;&#10;Alt&#10;&#10;Text"/>
+            <v:imagedata r:id="rId13" o:title="The&#10;&#10;Alt&#10;&#10;Text"/>
           </v:shape>
         </w:pict>
       </w:r>
@@ -1711,7 +1888,7 @@
         </w:rPr>
         <w:t xml:space="preserve">a </w:t>
       </w:r>
-      <w:hyperlink r:id="rId13" w:history="1">
+      <w:hyperlink r:id="rId14" w:history="1">
         <w:r>
           <w:rPr>
             <w:rStyle w:val="Hyperlink"/>
@@ -2234,6 +2411,1322 @@
       <w:pPr>
         <w:pStyle w:val="BodyText"/>
         <w:jc w:val="both"/>
+        <w:rPr>
+          <w:lang w:val="en-GB"/>
+        </w:rPr>
+      </w:pPr>
+    </w:p>
+    <w:p>
+      <w:pPr>
+        <w:pStyle w:val="Heading2"/>
+      </w:pPr>
+      <w:r>
+        <w:t>Targets with conditional rendering</w:t>
+      </w:r>
+    </w:p>
+    <w:p>
+      <w:pPr>
+        <w:pStyle w:val="BodyText"/>
+        <w:jc w:val="both"/>
+        <w:rPr>
+          <w:lang w:val="en-GB"/>
+        </w:rPr>
+      </w:pPr>
+      <w:r>
+        <w:rPr>
+          <w:lang w:val="en-GB"/>
+        </w:rPr>
+        <w:t>Text.</w:t>
+      </w:r>
+    </w:p>
+    <w:p>
+      <w:pPr>
+        <w:pStyle w:val="Caption"/>
+        <w:rPr>
+          <w:i w:val="0"/>
+          <w:iCs/>
+          <w:highlight w:val="lightGray"/>
+        </w:rPr>
+      </w:pPr>
+      <w:bookmarkStart w:id="19" w:name="_Ref216168647"/>
+      <w:bookmarkStart w:id="20" w:name="_Ref216168653"/>
+      <w:bookmarkStart w:id="21" w:name="fig_onlyDigital"/>
+      <w:r>
+        <w:rPr>
+          <w:b/>
+          <w:bCs/>
+          <w:i w:val="0"/>
+          <w:iCs/>
+          <w:highlight w:val="lightGray"/>
+        </w:rPr>
+        <w:t xml:space="preserve">Figure </w:t>
+      </w:r>
+      <w:r>
+        <w:rPr>
+          <w:b/>
+          <w:bCs/>
+          <w:i w:val="0"/>
+          <w:iCs/>
+          <w:highlight w:val="lightGray"/>
+        </w:rPr>
+        <w:fldChar w:fldCharType="begin"/>
+      </w:r>
+      <w:r>
+        <w:rPr>
+          <w:b/>
+          <w:bCs/>
+          <w:i w:val="0"/>
+          <w:iCs/>
+          <w:highlight w:val="lightGray"/>
+        </w:rPr>
+        <w:instrText xml:space="preserve"> SEQ Figure \* ARABIC </w:instrText>
+      </w:r>
+      <w:r>
+        <w:rPr>
+          <w:b/>
+          <w:bCs/>
+          <w:i w:val="0"/>
+          <w:iCs/>
+          <w:highlight w:val="lightGray"/>
+        </w:rPr>
+        <w:fldChar w:fldCharType="separate"/>
+      </w:r>
+      <w:r>
+        <w:rPr>
+          <w:b/>
+          <w:bCs/>
+          <w:i w:val="0"/>
+          <w:iCs/>
+          <w:noProof/>
+          <w:highlight w:val="lightGray"/>
+        </w:rPr>
+        <w:t>4</w:t>
+      </w:r>
+      <w:r>
+        <w:rPr>
+          <w:b/>
+          <w:bCs/>
+          <w:i w:val="0"/>
+          <w:iCs/>
+          <w:highlight w:val="lightGray"/>
+        </w:rPr>
+        <w:fldChar w:fldCharType="end"/>
+      </w:r>
+      <w:bookmarkEnd w:id="20"/>
+      <w:r>
+        <w:rPr>
+          <w:b/>
+          <w:bCs/>
+          <w:i w:val="0"/>
+          <w:iCs/>
+          <w:highlight w:val="lightGray"/>
+        </w:rPr>
+        <w:t>:</w:t>
+      </w:r>
+      <w:r>
+        <w:rPr>
+          <w:i w:val="0"/>
+          <w:iCs/>
+          <w:highlight w:val="lightGray"/>
+        </w:rPr>
+        <w:t xml:space="preserve"> Figure only in digital version.</w:t>
+      </w:r>
+      <w:bookmarkEnd w:id="19"/>
+    </w:p>
+    <w:bookmarkEnd w:id="21"/>
+    <w:p>
+      <w:pPr>
+        <w:pStyle w:val="BodyText"/>
+        <w:rPr>
+          <w:highlight w:val="lightGray"/>
+        </w:rPr>
+      </w:pPr>
+      <w:r>
+        <w:rPr>
+          <w:noProof/>
+          <w:highlight w:val="lightGray"/>
+        </w:rPr>
+        <w:lastRenderedPageBreak/>
+        <w:drawing>
+          <wp:inline distT="0" distB="0" distL="0" distR="0" wp14:anchorId="4F617502" wp14:editId="68D2BD98">
+            <wp:extent cx="1245326" cy="1466850"/>
+            <wp:effectExtent l="0" t="0" r="0" b="0"/>
+            <wp:docPr id="539647458" name="Picture 1" descr="A close up of an orange&#10;&#10;AI-generated content may be incorrect."/>
+            <wp:cNvGraphicFramePr>
+              <a:graphicFrameLocks xmlns:a="http://schemas.openxmlformats.org/drawingml/2006/main" noChangeAspect="1"/>
+            </wp:cNvGraphicFramePr>
+            <a:graphic xmlns:a="http://schemas.openxmlformats.org/drawingml/2006/main">
+              <a:graphicData uri="http://schemas.openxmlformats.org/drawingml/2006/picture">
+                <pic:pic xmlns:pic="http://schemas.openxmlformats.org/drawingml/2006/picture">
+                  <pic:nvPicPr>
+                    <pic:cNvPr id="539647458" name="Picture 1" descr="A close up of an orange&#10;&#10;AI-generated content may be incorrect."/>
+                    <pic:cNvPicPr>
+                      <a:picLocks noChangeAspect="1" noChangeArrowheads="1"/>
+                    </pic:cNvPicPr>
+                  </pic:nvPicPr>
+                  <pic:blipFill>
+                    <a:blip r:embed="rId15" cstate="print">
+                      <a:extLst>
+                        <a:ext uri="{28A0092B-C50C-407E-A947-70E740481C1C}">
+                          <a14:useLocalDpi xmlns:a14="http://schemas.microsoft.com/office/drawing/2010/main" val="0"/>
+                        </a:ext>
+                      </a:extLst>
+                    </a:blip>
+                    <a:srcRect/>
+                    <a:stretch>
+                      <a:fillRect/>
+                    </a:stretch>
+                  </pic:blipFill>
+                  <pic:spPr bwMode="auto">
+                    <a:xfrm>
+                      <a:off x="0" y="0"/>
+                      <a:ext cx="1251310" cy="1473899"/>
+                    </a:xfrm>
+                    <a:prstGeom prst="rect">
+                      <a:avLst/>
+                    </a:prstGeom>
+                    <a:noFill/>
+                    <a:ln>
+                      <a:noFill/>
+                    </a:ln>
+                  </pic:spPr>
+                </pic:pic>
+              </a:graphicData>
+            </a:graphic>
+          </wp:inline>
+        </w:drawing>
+      </w:r>
+    </w:p>
+    <w:tbl>
+      <w:tblPr>
+        <w:tblStyle w:val="TableGrid"/>
+        <w:tblW w:w="0" w:type="auto"/>
+        <w:tblLook w:val="04A0" w:firstRow="1" w:lastRow="0" w:firstColumn="1" w:lastColumn="0" w:noHBand="0" w:noVBand="1"/>
+      </w:tblPr>
+      <w:tblGrid>
+        <w:gridCol w:w="1541"/>
+        <w:gridCol w:w="7701"/>
+      </w:tblGrid>
+      <w:tr>
+        <w:tc>
+          <w:tcPr>
+            <w:tcW w:w="1600" w:type="dxa"/>
+          </w:tcPr>
+          <w:p>
+            <w:pPr>
+              <w:pStyle w:val="Compact"/>
+              <w:rPr>
+                <w:sz w:val="18"/>
+                <w:szCs w:val="18"/>
+                <w:highlight w:val="lightGray"/>
+              </w:rPr>
+            </w:pPr>
+            <w:r>
+              <w:rPr>
+                <w:sz w:val="18"/>
+                <w:szCs w:val="18"/>
+                <w:highlight w:val="lightGray"/>
+              </w:rPr>
+              <w:t>##Digital-input</w:t>
+            </w:r>
+          </w:p>
+        </w:tc>
+        <w:tc>
+          <w:tcPr>
+            <w:tcW w:w="7750" w:type="dxa"/>
+          </w:tcPr>
+          <w:p>
+            <w:pPr>
+              <w:pStyle w:val="Compact"/>
+              <w:rPr>
+                <w:sz w:val="18"/>
+                <w:szCs w:val="18"/>
+                <w:highlight w:val="lightGray"/>
+              </w:rPr>
+            </w:pPr>
+            <w:r>
+              <w:rPr>
+                <w:sz w:val="18"/>
+                <w:szCs w:val="18"/>
+                <w:highlight w:val="lightGray"/>
+              </w:rPr>
+              <w:t>./assets/orange_low_resolution.png</w:t>
+            </w:r>
+          </w:p>
+        </w:tc>
+      </w:tr>
+      <w:tr>
+        <w:tc>
+          <w:tcPr>
+            <w:tcW w:w="1600" w:type="dxa"/>
+          </w:tcPr>
+          <w:p>
+            <w:pPr>
+              <w:pStyle w:val="Compact"/>
+              <w:rPr>
+                <w:sz w:val="18"/>
+                <w:szCs w:val="18"/>
+                <w:highlight w:val="lightGray"/>
+              </w:rPr>
+            </w:pPr>
+            <w:r>
+              <w:rPr>
+                <w:sz w:val="18"/>
+                <w:szCs w:val="18"/>
+                <w:highlight w:val="lightGray"/>
+              </w:rPr>
+              <w:t>##Source</w:t>
+            </w:r>
+          </w:p>
+        </w:tc>
+        <w:tc>
+          <w:tcPr>
+            <w:tcW w:w="7750" w:type="dxa"/>
+          </w:tcPr>
+          <w:p>
+            <w:pPr>
+              <w:pStyle w:val="Compact"/>
+              <w:rPr>
+                <w:rFonts w:cstheme="majorHAnsi"/>
+                <w:sz w:val="18"/>
+                <w:szCs w:val="18"/>
+                <w:highlight w:val="lightGray"/>
+              </w:rPr>
+            </w:pPr>
+            <w:hyperlink r:id="rId16" w:history="1">
+              <w:r>
+                <w:rPr>
+                  <w:rStyle w:val="Hyperlink"/>
+                  <w:rFonts w:cstheme="majorHAnsi"/>
+                  <w:sz w:val="18"/>
+                  <w:szCs w:val="18"/>
+                  <w:highlight w:val="lightGray"/>
+                </w:rPr>
+                <w:t>https://web.archive.org/web/20170702171643/https://openclipart.org/detail/237816/orange-low-resolution</w:t>
+              </w:r>
+            </w:hyperlink>
+          </w:p>
+          <w:p>
+            <w:pPr>
+              <w:pStyle w:val="Compact"/>
+              <w:rPr>
+                <w:rFonts w:cstheme="majorHAnsi"/>
+                <w:sz w:val="18"/>
+                <w:szCs w:val="18"/>
+                <w:highlight w:val="lightGray"/>
+              </w:rPr>
+            </w:pPr>
+            <w:r>
+              <w:rPr>
+                <w:rFonts w:cstheme="majorHAnsi"/>
+                <w:sz w:val="18"/>
+                <w:szCs w:val="18"/>
+                <w:highlight w:val="lightGray"/>
+              </w:rPr>
+              <w:t>Published under Creative Commons Zero 1.0 Public Domain License (</w:t>
+            </w:r>
+            <w:hyperlink r:id="rId17" w:history="1">
+              <w:r>
+                <w:rPr>
+                  <w:rStyle w:val="Hyperlink"/>
+                  <w:rFonts w:cstheme="majorHAnsi"/>
+                  <w:sz w:val="18"/>
+                  <w:szCs w:val="18"/>
+                  <w:highlight w:val="lightGray"/>
+                </w:rPr>
+                <w:t>https://openclipart.org/share</w:t>
+              </w:r>
+            </w:hyperlink>
+            <w:r>
+              <w:rPr>
+                <w:rFonts w:cstheme="majorHAnsi"/>
+                <w:sz w:val="18"/>
+                <w:szCs w:val="18"/>
+                <w:highlight w:val="lightGray"/>
+              </w:rPr>
+              <w:t>)</w:t>
+            </w:r>
+          </w:p>
+        </w:tc>
+      </w:tr>
+      <w:tr>
+        <w:tc>
+          <w:tcPr>
+            <w:tcW w:w="1600" w:type="dxa"/>
+          </w:tcPr>
+          <w:p>
+            <w:pPr>
+              <w:pStyle w:val="Compact"/>
+              <w:rPr>
+                <w:sz w:val="18"/>
+                <w:szCs w:val="18"/>
+                <w:highlight w:val="lightGray"/>
+              </w:rPr>
+            </w:pPr>
+            <w:r>
+              <w:rPr>
+                <w:sz w:val="18"/>
+                <w:szCs w:val="18"/>
+                <w:highlight w:val="lightGray"/>
+              </w:rPr>
+              <w:t>##Author</w:t>
+            </w:r>
+          </w:p>
+        </w:tc>
+        <w:tc>
+          <w:tcPr>
+            <w:tcW w:w="7750" w:type="dxa"/>
+          </w:tcPr>
+          <w:p>
+            <w:pPr>
+              <w:pStyle w:val="Compact"/>
+              <w:rPr>
+                <w:rFonts w:cstheme="majorHAnsi"/>
+                <w:sz w:val="18"/>
+                <w:szCs w:val="18"/>
+                <w:highlight w:val="lightGray"/>
+              </w:rPr>
+            </w:pPr>
+            <w:r>
+              <w:rPr>
+                <w:rFonts w:eastAsia="Times New Roman" w:cstheme="majorHAnsi"/>
+                <w:sz w:val="18"/>
+                <w:szCs w:val="18"/>
+                <w:highlight w:val="lightGray"/>
+              </w:rPr>
+              <w:t>Franz Eugen Köhler</w:t>
+            </w:r>
+          </w:p>
+        </w:tc>
+      </w:tr>
+      <w:tr>
+        <w:tc>
+          <w:tcPr>
+            <w:tcW w:w="1600" w:type="dxa"/>
+          </w:tcPr>
+          <w:p>
+            <w:pPr>
+              <w:pStyle w:val="Compact"/>
+              <w:rPr>
+                <w:sz w:val="18"/>
+                <w:szCs w:val="18"/>
+                <w:highlight w:val="lightGray"/>
+              </w:rPr>
+            </w:pPr>
+            <w:r>
+              <w:rPr>
+                <w:sz w:val="18"/>
+                <w:szCs w:val="18"/>
+                <w:highlight w:val="lightGray"/>
+              </w:rPr>
+              <w:t>##Alt-text</w:t>
+            </w:r>
+          </w:p>
+        </w:tc>
+        <w:tc>
+          <w:tcPr>
+            <w:tcW w:w="7750" w:type="dxa"/>
+          </w:tcPr>
+          <w:p>
+            <w:pPr>
+              <w:pStyle w:val="Compact"/>
+              <w:rPr>
+                <w:rFonts w:cstheme="majorHAnsi"/>
+                <w:sz w:val="18"/>
+                <w:szCs w:val="18"/>
+              </w:rPr>
+            </w:pPr>
+            <w:r>
+              <w:rPr>
+                <w:rFonts w:eastAsia="Times New Roman" w:cstheme="majorHAnsi"/>
+                <w:sz w:val="18"/>
+                <w:szCs w:val="18"/>
+                <w:highlight w:val="lightGray"/>
+              </w:rPr>
+              <w:t>Low resolution drawing of an orange</w:t>
+            </w:r>
+          </w:p>
+        </w:tc>
+      </w:tr>
+    </w:tbl>
+    <w:p>
+      <w:pPr>
+        <w:pStyle w:val="Caption"/>
+        <w:rPr>
+          <w:i w:val="0"/>
+          <w:iCs/>
+        </w:rPr>
+      </w:pPr>
+    </w:p>
+    <w:p>
+      <w:pPr>
+        <w:pStyle w:val="Caption"/>
+        <w:rPr>
+          <w:i w:val="0"/>
+          <w:iCs/>
+          <w:highlight w:val="cyan"/>
+        </w:rPr>
+      </w:pPr>
+      <w:bookmarkStart w:id="22" w:name="_Ref216168684"/>
+      <w:bookmarkStart w:id="23" w:name="fig_onlyPaper"/>
+      <w:r>
+        <w:rPr>
+          <w:b/>
+          <w:bCs/>
+          <w:i w:val="0"/>
+          <w:iCs/>
+          <w:highlight w:val="cyan"/>
+        </w:rPr>
+        <w:t xml:space="preserve">Figure </w:t>
+      </w:r>
+      <w:r>
+        <w:rPr>
+          <w:b/>
+          <w:bCs/>
+          <w:i w:val="0"/>
+          <w:iCs/>
+          <w:highlight w:val="cyan"/>
+        </w:rPr>
+        <w:fldChar w:fldCharType="begin"/>
+      </w:r>
+      <w:r>
+        <w:rPr>
+          <w:b/>
+          <w:bCs/>
+          <w:i w:val="0"/>
+          <w:iCs/>
+          <w:highlight w:val="cyan"/>
+        </w:rPr>
+        <w:instrText xml:space="preserve"> SEQ Figure \* ARABIC </w:instrText>
+      </w:r>
+      <w:r>
+        <w:rPr>
+          <w:b/>
+          <w:bCs/>
+          <w:i w:val="0"/>
+          <w:iCs/>
+          <w:highlight w:val="cyan"/>
+        </w:rPr>
+        <w:fldChar w:fldCharType="separate"/>
+      </w:r>
+      <w:r>
+        <w:rPr>
+          <w:b/>
+          <w:bCs/>
+          <w:i w:val="0"/>
+          <w:iCs/>
+          <w:noProof/>
+          <w:highlight w:val="cyan"/>
+        </w:rPr>
+        <w:t>5</w:t>
+      </w:r>
+      <w:r>
+        <w:rPr>
+          <w:b/>
+          <w:bCs/>
+          <w:i w:val="0"/>
+          <w:iCs/>
+          <w:highlight w:val="cyan"/>
+        </w:rPr>
+        <w:fldChar w:fldCharType="end"/>
+      </w:r>
+      <w:bookmarkEnd w:id="22"/>
+      <w:r>
+        <w:rPr>
+          <w:b/>
+          <w:bCs/>
+          <w:i w:val="0"/>
+          <w:iCs/>
+          <w:highlight w:val="cyan"/>
+        </w:rPr>
+        <w:t>:</w:t>
+      </w:r>
+      <w:r>
+        <w:rPr>
+          <w:i w:val="0"/>
+          <w:iCs/>
+          <w:highlight w:val="cyan"/>
+        </w:rPr>
+        <w:t xml:space="preserve"> Figure only in paper version.</w:t>
+      </w:r>
+    </w:p>
+    <w:bookmarkEnd w:id="23"/>
+    <w:p>
+      <w:pPr>
+        <w:pStyle w:val="BodyText"/>
+        <w:rPr>
+          <w:highlight w:val="cyan"/>
+        </w:rPr>
+      </w:pPr>
+      <w:r>
+        <w:rPr>
+          <w:noProof/>
+          <w:highlight w:val="cyan"/>
+        </w:rPr>
+        <w:drawing>
+          <wp:inline distT="0" distB="0" distL="0" distR="0" wp14:anchorId="5F096122" wp14:editId="05E031D1">
+            <wp:extent cx="1504950" cy="1504950"/>
+            <wp:effectExtent l="0" t="0" r="0" b="0"/>
+            <wp:docPr id="486604714" name="Picture 2" descr="A black and white drawing of an orange&#10;&#10;AI-generated content may be incorrect."/>
+            <wp:cNvGraphicFramePr>
+              <a:graphicFrameLocks xmlns:a="http://schemas.openxmlformats.org/drawingml/2006/main" noChangeAspect="1"/>
+            </wp:cNvGraphicFramePr>
+            <a:graphic xmlns:a="http://schemas.openxmlformats.org/drawingml/2006/main">
+              <a:graphicData uri="http://schemas.openxmlformats.org/drawingml/2006/picture">
+                <pic:pic xmlns:pic="http://schemas.openxmlformats.org/drawingml/2006/picture">
+                  <pic:nvPicPr>
+                    <pic:cNvPr id="486604714" name="Picture 2" descr="A black and white drawing of an orange&#10;&#10;AI-generated content may be incorrect."/>
+                    <pic:cNvPicPr>
+                      <a:picLocks noChangeAspect="1" noChangeArrowheads="1"/>
+                    </pic:cNvPicPr>
+                  </pic:nvPicPr>
+                  <pic:blipFill>
+                    <a:blip r:embed="rId18" cstate="print">
+                      <a:extLst>
+                        <a:ext uri="{28A0092B-C50C-407E-A947-70E740481C1C}">
+                          <a14:useLocalDpi xmlns:a14="http://schemas.microsoft.com/office/drawing/2010/main" val="0"/>
+                        </a:ext>
+                      </a:extLst>
+                    </a:blip>
+                    <a:srcRect/>
+                    <a:stretch>
+                      <a:fillRect/>
+                    </a:stretch>
+                  </pic:blipFill>
+                  <pic:spPr bwMode="auto">
+                    <a:xfrm>
+                      <a:off x="0" y="0"/>
+                      <a:ext cx="1504950" cy="1504950"/>
+                    </a:xfrm>
+                    <a:prstGeom prst="rect">
+                      <a:avLst/>
+                    </a:prstGeom>
+                    <a:noFill/>
+                    <a:ln>
+                      <a:noFill/>
+                    </a:ln>
+                  </pic:spPr>
+                </pic:pic>
+              </a:graphicData>
+            </a:graphic>
+          </wp:inline>
+        </w:drawing>
+      </w:r>
+    </w:p>
+    <w:tbl>
+      <w:tblPr>
+        <w:tblStyle w:val="TableGrid"/>
+        <w:tblW w:w="0" w:type="auto"/>
+        <w:tblLook w:val="04A0" w:firstRow="1" w:lastRow="0" w:firstColumn="1" w:lastColumn="0" w:noHBand="0" w:noVBand="1"/>
+      </w:tblPr>
+      <w:tblGrid>
+        <w:gridCol w:w="1499"/>
+        <w:gridCol w:w="7743"/>
+      </w:tblGrid>
+      <w:tr>
+        <w:tc>
+          <w:tcPr>
+            <w:tcW w:w="1525" w:type="dxa"/>
+          </w:tcPr>
+          <w:p>
+            <w:pPr>
+              <w:pStyle w:val="Compact"/>
+              <w:rPr>
+                <w:sz w:val="18"/>
+                <w:szCs w:val="18"/>
+                <w:highlight w:val="cyan"/>
+              </w:rPr>
+            </w:pPr>
+            <w:r>
+              <w:rPr>
+                <w:sz w:val="18"/>
+                <w:szCs w:val="18"/>
+                <w:highlight w:val="cyan"/>
+              </w:rPr>
+              <w:t>##Paper-input</w:t>
+            </w:r>
+          </w:p>
+        </w:tc>
+        <w:tc>
+          <w:tcPr>
+            <w:tcW w:w="7825" w:type="dxa"/>
+          </w:tcPr>
+          <w:p>
+            <w:pPr>
+              <w:pStyle w:val="Compact"/>
+              <w:rPr>
+                <w:sz w:val="18"/>
+                <w:szCs w:val="18"/>
+                <w:highlight w:val="cyan"/>
+              </w:rPr>
+            </w:pPr>
+            <w:r>
+              <w:rPr>
+                <w:sz w:val="18"/>
+                <w:szCs w:val="18"/>
+                <w:highlight w:val="cyan"/>
+              </w:rPr>
+              <w:t>./assets/orange_black_and_white.png</w:t>
+            </w:r>
+          </w:p>
+        </w:tc>
+      </w:tr>
+      <w:tr>
+        <w:tc>
+          <w:tcPr>
+            <w:tcW w:w="1525" w:type="dxa"/>
+          </w:tcPr>
+          <w:p>
+            <w:pPr>
+              <w:pStyle w:val="Compact"/>
+              <w:rPr>
+                <w:sz w:val="18"/>
+                <w:szCs w:val="18"/>
+                <w:highlight w:val="cyan"/>
+              </w:rPr>
+            </w:pPr>
+            <w:r>
+              <w:rPr>
+                <w:sz w:val="18"/>
+                <w:szCs w:val="18"/>
+                <w:highlight w:val="cyan"/>
+              </w:rPr>
+              <w:t>##Source</w:t>
+            </w:r>
+          </w:p>
+        </w:tc>
+        <w:tc>
+          <w:tcPr>
+            <w:tcW w:w="7825" w:type="dxa"/>
+          </w:tcPr>
+          <w:p>
+            <w:pPr>
+              <w:pStyle w:val="Compact"/>
+              <w:rPr>
+                <w:highlight w:val="cyan"/>
+              </w:rPr>
+            </w:pPr>
+            <w:hyperlink r:id="rId19" w:history="1">
+              <w:r>
+                <w:rPr>
+                  <w:rStyle w:val="Hyperlink"/>
+                  <w:rFonts w:cstheme="majorHAnsi"/>
+                  <w:sz w:val="18"/>
+                  <w:szCs w:val="18"/>
+                  <w:highlight w:val="cyan"/>
+                </w:rPr>
+                <w:t>https://web.archive.org/web/20240226071359/https://freesvg.org/drawing-of-an-orange</w:t>
+              </w:r>
+            </w:hyperlink>
+            <w:r>
+              <w:rPr>
+                <w:rFonts w:cstheme="majorHAnsi"/>
+                <w:sz w:val="18"/>
+                <w:szCs w:val="18"/>
+                <w:highlight w:val="cyan"/>
+              </w:rPr>
+              <w:br/>
+              <w:t>Published under CC0 1.0 Public Domain (</w:t>
+            </w:r>
+            <w:hyperlink r:id="rId20" w:history="1">
+              <w:r>
+                <w:rPr>
+                  <w:rStyle w:val="Hyperlink"/>
+                  <w:rFonts w:cstheme="majorHAnsi"/>
+                  <w:sz w:val="18"/>
+                  <w:szCs w:val="18"/>
+                  <w:highlight w:val="cyan"/>
+                </w:rPr>
+                <w:t>https://creativecommons.org/publicdomain/</w:t>
+              </w:r>
+            </w:hyperlink>
+          </w:p>
+          <w:p>
+            <w:pPr>
+              <w:pStyle w:val="Compact"/>
+              <w:rPr>
+                <w:rFonts w:cstheme="majorHAnsi"/>
+                <w:sz w:val="18"/>
+                <w:szCs w:val="18"/>
+                <w:highlight w:val="cyan"/>
+              </w:rPr>
+            </w:pPr>
+            <w:hyperlink r:id="rId21" w:history="1">
+              <w:r>
+                <w:rPr>
+                  <w:rStyle w:val="Hyperlink"/>
+                  <w:highlight w:val="cyan"/>
+                </w:rPr>
+                <w:t>https://openclipart.org/share</w:t>
+              </w:r>
+            </w:hyperlink>
+            <w:r>
+              <w:rPr>
+                <w:rFonts w:cstheme="majorHAnsi"/>
+                <w:sz w:val="18"/>
+                <w:szCs w:val="18"/>
+                <w:highlight w:val="cyan"/>
+              </w:rPr>
+              <w:t>)</w:t>
+            </w:r>
+          </w:p>
+        </w:tc>
+      </w:tr>
+      <w:tr>
+        <w:tc>
+          <w:tcPr>
+            <w:tcW w:w="1525" w:type="dxa"/>
+          </w:tcPr>
+          <w:p>
+            <w:pPr>
+              <w:pStyle w:val="Compact"/>
+              <w:rPr>
+                <w:sz w:val="18"/>
+                <w:szCs w:val="18"/>
+                <w:highlight w:val="cyan"/>
+              </w:rPr>
+            </w:pPr>
+            <w:r>
+              <w:rPr>
+                <w:sz w:val="18"/>
+                <w:szCs w:val="18"/>
+                <w:highlight w:val="cyan"/>
+              </w:rPr>
+              <w:t>##Author</w:t>
+            </w:r>
+          </w:p>
+        </w:tc>
+        <w:tc>
+          <w:tcPr>
+            <w:tcW w:w="7825" w:type="dxa"/>
+          </w:tcPr>
+          <w:p>
+            <w:pPr>
+              <w:pStyle w:val="Compact"/>
+              <w:rPr>
+                <w:rFonts w:cstheme="majorHAnsi"/>
+                <w:sz w:val="18"/>
+                <w:szCs w:val="18"/>
+                <w:highlight w:val="cyan"/>
+              </w:rPr>
+            </w:pPr>
+            <w:r>
+              <w:rPr>
+                <w:rFonts w:eastAsia="Times New Roman" w:cstheme="majorHAnsi"/>
+                <w:sz w:val="18"/>
+                <w:szCs w:val="18"/>
+                <w:highlight w:val="cyan"/>
+              </w:rPr>
+              <w:t>Unknown</w:t>
+            </w:r>
+          </w:p>
+        </w:tc>
+      </w:tr>
+      <w:tr>
+        <w:tc>
+          <w:tcPr>
+            <w:tcW w:w="1525" w:type="dxa"/>
+          </w:tcPr>
+          <w:p>
+            <w:pPr>
+              <w:pStyle w:val="Compact"/>
+              <w:rPr>
+                <w:sz w:val="18"/>
+                <w:szCs w:val="18"/>
+                <w:highlight w:val="cyan"/>
+              </w:rPr>
+            </w:pPr>
+            <w:r>
+              <w:rPr>
+                <w:sz w:val="18"/>
+                <w:szCs w:val="18"/>
+                <w:highlight w:val="cyan"/>
+              </w:rPr>
+              <w:t>##Alt-text</w:t>
+            </w:r>
+          </w:p>
+        </w:tc>
+        <w:tc>
+          <w:tcPr>
+            <w:tcW w:w="7825" w:type="dxa"/>
+          </w:tcPr>
+          <w:p>
+            <w:pPr>
+              <w:pStyle w:val="Compact"/>
+              <w:rPr>
+                <w:rFonts w:cstheme="majorHAnsi"/>
+                <w:sz w:val="18"/>
+                <w:szCs w:val="18"/>
+                <w:highlight w:val="cyan"/>
+              </w:rPr>
+            </w:pPr>
+            <w:r>
+              <w:rPr>
+                <w:rFonts w:eastAsia="Times New Roman" w:cstheme="majorHAnsi"/>
+                <w:sz w:val="18"/>
+                <w:szCs w:val="18"/>
+                <w:highlight w:val="cyan"/>
+              </w:rPr>
+              <w:t>Black and white drawing of an orange</w:t>
+            </w:r>
+          </w:p>
+        </w:tc>
+      </w:tr>
+    </w:tbl>
+    <w:p>
+      <w:pPr>
+        <w:pStyle w:val="Caption"/>
+        <w:rPr>
+          <w:i w:val="0"/>
+          <w:iCs/>
+        </w:rPr>
+      </w:pPr>
+    </w:p>
+    <w:p>
+      <w:pPr>
+        <w:pStyle w:val="Caption"/>
+        <w:rPr>
+          <w:i w:val="0"/>
+          <w:iCs/>
+        </w:rPr>
+      </w:pPr>
+      <w:bookmarkStart w:id="24" w:name="_Ref216168694"/>
+      <w:bookmarkStart w:id="25" w:name="fig_bothDigitalAndPaper"/>
+      <w:r>
+        <w:rPr>
+          <w:b/>
+          <w:bCs/>
+          <w:i w:val="0"/>
+          <w:iCs/>
+        </w:rPr>
+        <w:t xml:space="preserve">Figure </w:t>
+      </w:r>
+      <w:r>
+        <w:rPr>
+          <w:b/>
+          <w:bCs/>
+          <w:i w:val="0"/>
+          <w:iCs/>
+        </w:rPr>
+        <w:fldChar w:fldCharType="begin"/>
+      </w:r>
+      <w:r>
+        <w:rPr>
+          <w:b/>
+          <w:bCs/>
+          <w:i w:val="0"/>
+          <w:iCs/>
+        </w:rPr>
+        <w:instrText xml:space="preserve"> SEQ Figure \* ARABIC </w:instrText>
+      </w:r>
+      <w:r>
+        <w:rPr>
+          <w:b/>
+          <w:bCs/>
+          <w:i w:val="0"/>
+          <w:iCs/>
+        </w:rPr>
+        <w:fldChar w:fldCharType="separate"/>
+      </w:r>
+      <w:r>
+        <w:rPr>
+          <w:b/>
+          <w:bCs/>
+          <w:i w:val="0"/>
+          <w:iCs/>
+          <w:noProof/>
+        </w:rPr>
+        <w:t>6</w:t>
+      </w:r>
+      <w:r>
+        <w:rPr>
+          <w:b/>
+          <w:bCs/>
+          <w:i w:val="0"/>
+          <w:iCs/>
+        </w:rPr>
+        <w:fldChar w:fldCharType="end"/>
+      </w:r>
+      <w:bookmarkEnd w:id="24"/>
+      <w:r>
+        <w:rPr>
+          <w:b/>
+          <w:bCs/>
+          <w:i w:val="0"/>
+          <w:iCs/>
+        </w:rPr>
+        <w:t>:</w:t>
+      </w:r>
+      <w:r>
+        <w:rPr>
+          <w:i w:val="0"/>
+          <w:iCs/>
+        </w:rPr>
+        <w:t xml:space="preserve"> Figure in both digital and paper.</w:t>
+      </w:r>
+    </w:p>
+    <w:bookmarkEnd w:id="25"/>
+    <w:p>
+      <w:pPr>
+        <w:pStyle w:val="BodyText"/>
+        <w:jc w:val="both"/>
+      </w:pPr>
+      <w:r>
+        <w:rPr>
+          <w:noProof/>
+        </w:rPr>
+        <w:drawing>
+          <wp:inline distT="0" distB="0" distL="0" distR="0" wp14:anchorId="4190C55D" wp14:editId="69F06530">
+            <wp:extent cx="1397635" cy="1181100"/>
+            <wp:effectExtent l="0" t="0" r="0" b="0"/>
+            <wp:docPr id="1" name="Picture 1" descr="A red blue and grey text on a black background&#10;&#10;AI-generated content may be incorrect."/>
+            <wp:cNvGraphicFramePr>
+              <a:graphicFrameLocks xmlns:a="http://schemas.openxmlformats.org/drawingml/2006/main" noChangeAspect="1"/>
+            </wp:cNvGraphicFramePr>
+            <a:graphic xmlns:a="http://schemas.openxmlformats.org/drawingml/2006/main">
+              <a:graphicData uri="http://schemas.openxmlformats.org/drawingml/2006/picture">
+                <pic:pic xmlns:pic="http://schemas.openxmlformats.org/drawingml/2006/picture">
+                  <pic:nvPicPr>
+                    <pic:cNvPr id="1" name="Picture 1" descr="A red blue and grey text on a black background&#10;&#10;AI-generated content may be incorrect."/>
+                    <pic:cNvPicPr>
+                      <a:picLocks noChangeAspect="1" noChangeArrowheads="1"/>
+                    </pic:cNvPicPr>
+                  </pic:nvPicPr>
+                  <pic:blipFill>
+                    <a:blip r:embed="rId22">
+                      <a:extLst>
+                        <a:ext uri="{28A0092B-C50C-407E-A947-70E740481C1C}">
+                          <a14:useLocalDpi xmlns:a14="http://schemas.microsoft.com/office/drawing/2010/main" val="0"/>
+                        </a:ext>
+                      </a:extLst>
+                    </a:blip>
+                    <a:srcRect/>
+                    <a:stretch>
+                      <a:fillRect/>
+                    </a:stretch>
+                  </pic:blipFill>
+                  <pic:spPr bwMode="auto">
+                    <a:xfrm>
+                      <a:off x="0" y="0"/>
+                      <a:ext cx="1399740" cy="1182879"/>
+                    </a:xfrm>
+                    <a:prstGeom prst="rect">
+                      <a:avLst/>
+                    </a:prstGeom>
+                    <a:noFill/>
+                    <a:ln>
+                      <a:noFill/>
+                    </a:ln>
+                  </pic:spPr>
+                </pic:pic>
+              </a:graphicData>
+            </a:graphic>
+          </wp:inline>
+        </w:drawing>
+      </w:r>
+    </w:p>
+    <w:tbl>
+      <w:tblPr>
+        <w:tblW w:w="9345" w:type="dxa"/>
+        <w:tblBorders>
+          <w:top w:val="single" w:sz="4" w:space="0" w:color="auto"/>
+          <w:left w:val="single" w:sz="4" w:space="0" w:color="auto"/>
+          <w:bottom w:val="single" w:sz="4" w:space="0" w:color="auto"/>
+          <w:right w:val="single" w:sz="4" w:space="0" w:color="auto"/>
+          <w:insideH w:val="single" w:sz="4" w:space="0" w:color="auto"/>
+          <w:insideV w:val="single" w:sz="4" w:space="0" w:color="auto"/>
+        </w:tblBorders>
+        <w:tblCellMar>
+          <w:left w:w="0" w:type="dxa"/>
+          <w:right w:w="0" w:type="dxa"/>
+        </w:tblCellMar>
+        <w:tblLook w:val="04A0" w:firstRow="1" w:lastRow="0" w:firstColumn="1" w:lastColumn="0" w:noHBand="0" w:noVBand="1"/>
+      </w:tblPr>
+      <w:tblGrid>
+        <w:gridCol w:w="1345"/>
+        <w:gridCol w:w="8000"/>
+      </w:tblGrid>
+      <w:tr>
+        <w:trPr>
+          <w:trHeight w:val="300"/>
+        </w:trPr>
+        <w:tc>
+          <w:tcPr>
+            <w:tcW w:w="1345" w:type="dxa"/>
+            <w:hideMark/>
+          </w:tcPr>
+          <w:p>
+            <w:pPr>
+              <w:spacing w:after="0"/>
+              <w:textAlignment w:val="baseline"/>
+              <w:rPr>
+                <w:rFonts w:ascii="Times New Roman" w:eastAsia="Times New Roman" w:hAnsi="Times New Roman" w:cs="Times New Roman"/>
+                <w:b/>
+                <w:bCs/>
+                <w:sz w:val="16"/>
+                <w:szCs w:val="16"/>
+              </w:rPr>
+            </w:pPr>
+            <w:r>
+              <w:rPr>
+                <w:sz w:val="16"/>
+                <w:szCs w:val="16"/>
+              </w:rPr>
+              <w:t>##Digital-input</w:t>
+            </w:r>
+          </w:p>
+        </w:tc>
+        <w:tc>
+          <w:tcPr>
+            <w:tcW w:w="8000" w:type="dxa"/>
+          </w:tcPr>
+          <w:p>
+            <w:pPr>
+              <w:spacing w:after="0"/>
+              <w:textAlignment w:val="baseline"/>
+              <w:rPr>
+                <w:rFonts w:ascii="Calibri" w:eastAsia="Times New Roman" w:hAnsi="Calibri" w:cs="Calibri"/>
+                <w:sz w:val="16"/>
+                <w:szCs w:val="16"/>
+                <w:lang w:val="fr-FR"/>
+              </w:rPr>
+            </w:pPr>
+            <w:r>
+              <w:rPr>
+                <w:sz w:val="16"/>
+                <w:szCs w:val="16"/>
+                <w:lang w:val="fr-FR"/>
+              </w:rPr>
+              <w:t>./</w:t>
+            </w:r>
+            <w:del w:id="26" w:author="Pawel KAMINSKI" w:date="2024-06-17T11:16:00Z">
+              <w:r>
+                <w:rPr>
+                  <w:sz w:val="16"/>
+                  <w:szCs w:val="16"/>
+                  <w:lang w:val="fr-FR"/>
+                </w:rPr>
+                <w:delText>images</w:delText>
+              </w:r>
+            </w:del>
+            <w:ins w:id="27" w:author="Pawel KAMINSKI" w:date="2024-06-17T11:16:00Z">
+              <w:r>
+                <w:rPr>
+                  <w:sz w:val="16"/>
+                  <w:szCs w:val="16"/>
+                  <w:lang w:val="fr-FR"/>
+                </w:rPr>
+                <w:t>assets</w:t>
+              </w:r>
+            </w:ins>
+            <w:r>
+              <w:rPr>
+                <w:sz w:val="16"/>
+                <w:szCs w:val="16"/>
+                <w:lang w:val="fr-FR"/>
+              </w:rPr>
+              <w:t>/uni_logo.png</w:t>
+            </w:r>
+          </w:p>
+        </w:tc>
+      </w:tr>
+      <w:tr>
+        <w:trPr>
+          <w:trHeight w:val="300"/>
+        </w:trPr>
+        <w:tc>
+          <w:tcPr>
+            <w:tcW w:w="1345" w:type="dxa"/>
+          </w:tcPr>
+          <w:p>
+            <w:pPr>
+              <w:spacing w:after="0"/>
+              <w:textAlignment w:val="baseline"/>
+              <w:rPr>
+                <w:rFonts w:ascii="Calibri" w:eastAsia="Times New Roman" w:hAnsi="Calibri" w:cs="Calibri"/>
+                <w:sz w:val="16"/>
+                <w:szCs w:val="16"/>
+              </w:rPr>
+            </w:pPr>
+            <w:r>
+              <w:rPr>
+                <w:sz w:val="16"/>
+                <w:szCs w:val="16"/>
+              </w:rPr>
+              <w:t>##Paper-input</w:t>
+            </w:r>
+          </w:p>
+        </w:tc>
+        <w:tc>
+          <w:tcPr>
+            <w:tcW w:w="8000" w:type="dxa"/>
+          </w:tcPr>
+          <w:p>
+            <w:pPr>
+              <w:spacing w:after="0"/>
+              <w:textAlignment w:val="baseline"/>
+              <w:rPr>
+                <w:rFonts w:ascii="Calibri" w:eastAsia="Times New Roman" w:hAnsi="Calibri" w:cs="Calibri"/>
+                <w:sz w:val="16"/>
+                <w:szCs w:val="16"/>
+                <w:lang w:val="fr-FR"/>
+              </w:rPr>
+            </w:pPr>
+            <w:r>
+              <w:rPr>
+                <w:sz w:val="16"/>
+                <w:szCs w:val="16"/>
+                <w:lang w:val="fr-FR"/>
+              </w:rPr>
+              <w:t>./</w:t>
+            </w:r>
+            <w:del w:id="28" w:author="Pawel KAMINSKI" w:date="2024-06-17T11:16:00Z">
+              <w:r>
+                <w:rPr>
+                  <w:sz w:val="16"/>
+                  <w:szCs w:val="16"/>
+                  <w:lang w:val="fr-FR"/>
+                </w:rPr>
+                <w:delText>images</w:delText>
+              </w:r>
+            </w:del>
+            <w:ins w:id="29" w:author="Pawel KAMINSKI" w:date="2024-06-17T11:16:00Z">
+              <w:r>
+                <w:rPr>
+                  <w:sz w:val="16"/>
+                  <w:szCs w:val="16"/>
+                  <w:lang w:val="fr-FR"/>
+                </w:rPr>
+                <w:t>assets</w:t>
+              </w:r>
+            </w:ins>
+            <w:r>
+              <w:rPr>
+                <w:sz w:val="16"/>
+                <w:szCs w:val="16"/>
+                <w:lang w:val="fr-FR"/>
+              </w:rPr>
+              <w:t>/uni_logo.png</w:t>
+            </w:r>
+          </w:p>
+        </w:tc>
+      </w:tr>
+      <w:tr>
+        <w:trPr>
+          <w:trHeight w:val="300"/>
+        </w:trPr>
+        <w:tc>
+          <w:tcPr>
+            <w:tcW w:w="1345" w:type="dxa"/>
+          </w:tcPr>
+          <w:p>
+            <w:pPr>
+              <w:spacing w:after="0"/>
+              <w:textAlignment w:val="baseline"/>
+              <w:rPr>
+                <w:rFonts w:ascii="Calibri" w:eastAsia="Times New Roman" w:hAnsi="Calibri" w:cs="Calibri"/>
+                <w:sz w:val="16"/>
+                <w:szCs w:val="16"/>
+                <w:lang w:val="fr-FR"/>
+              </w:rPr>
+            </w:pPr>
+            <w:r>
+              <w:rPr>
+                <w:sz w:val="16"/>
+                <w:szCs w:val="16"/>
+              </w:rPr>
+              <w:t>##Source</w:t>
+            </w:r>
+          </w:p>
+        </w:tc>
+        <w:tc>
+          <w:tcPr>
+            <w:tcW w:w="8000" w:type="dxa"/>
+          </w:tcPr>
+          <w:p>
+            <w:pPr>
+              <w:spacing w:after="0"/>
+              <w:textAlignment w:val="baseline"/>
+              <w:rPr>
+                <w:rFonts w:ascii="Calibri" w:eastAsia="Times New Roman" w:hAnsi="Calibri" w:cs="Calibri"/>
+                <w:sz w:val="16"/>
+                <w:szCs w:val="16"/>
+                <w:lang w:val="fr-FR"/>
+              </w:rPr>
+            </w:pPr>
+            <w:r>
+              <w:rPr>
+                <w:rFonts w:cstheme="majorHAnsi"/>
+                <w:sz w:val="16"/>
+                <w:szCs w:val="16"/>
+                <w:lang w:val="fr-FR"/>
+              </w:rPr>
+              <w:t>https://en.m.wikipedia.org/wiki/File:University_of_Luxembourg_logo_(fr).svg</w:t>
+            </w:r>
+          </w:p>
+        </w:tc>
+      </w:tr>
+      <w:tr>
+        <w:trPr>
+          <w:trHeight w:val="300"/>
+        </w:trPr>
+        <w:tc>
+          <w:tcPr>
+            <w:tcW w:w="1345" w:type="dxa"/>
+          </w:tcPr>
+          <w:p>
+            <w:pPr>
+              <w:spacing w:after="0"/>
+              <w:textAlignment w:val="baseline"/>
+              <w:rPr>
+                <w:rFonts w:ascii="Calibri" w:eastAsia="Times New Roman" w:hAnsi="Calibri" w:cs="Calibri"/>
+                <w:sz w:val="16"/>
+                <w:szCs w:val="16"/>
+              </w:rPr>
+            </w:pPr>
+            <w:r>
+              <w:rPr>
+                <w:sz w:val="16"/>
+                <w:szCs w:val="16"/>
+              </w:rPr>
+              <w:t>##Alt-text</w:t>
+            </w:r>
+          </w:p>
+        </w:tc>
+        <w:tc>
+          <w:tcPr>
+            <w:tcW w:w="8000" w:type="dxa"/>
+          </w:tcPr>
+          <w:p>
+            <w:pPr>
+              <w:spacing w:after="0"/>
+              <w:textAlignment w:val="baseline"/>
+              <w:rPr>
+                <w:rFonts w:ascii="Calibri" w:eastAsia="Times New Roman" w:hAnsi="Calibri" w:cs="Calibri"/>
+                <w:sz w:val="16"/>
+                <w:szCs w:val="16"/>
+              </w:rPr>
+            </w:pPr>
+            <w:r>
+              <w:rPr>
+                <w:rFonts w:eastAsia="Times New Roman" w:cstheme="majorHAnsi"/>
+                <w:sz w:val="16"/>
+                <w:szCs w:val="16"/>
+              </w:rPr>
+              <w:t>Logo of University of Luxembourg in French pointing to the uni.lu website</w:t>
+            </w:r>
+          </w:p>
+        </w:tc>
+      </w:tr>
+    </w:tbl>
+    <w:p>
+      <w:pPr>
+        <w:pStyle w:val="Caption"/>
+        <w:rPr>
+          <w:i w:val="0"/>
+          <w:iCs/>
+          <w:lang w:val="en-GB"/>
+        </w:rPr>
       </w:pPr>
     </w:p>
     <w:sectPr>
@@ -2385,101 +3878,15 @@
         <v:path o:extrusionok="f" gradientshapeok="t" o:connecttype="rect"/>
         <o:lock v:ext="edit" aspectratio="t"/>
       </v:shapetype>
-      <v:shape id="_x0000_i1026" type="#_x0000_t75" alt="The&#10;&#10;Alt&#10;&#10;Text" style="width:7.5pt;height:7.5pt;visibility:visible;mso-wrap-style:square" o:bullet="t">
+      <v:shape id="_x0000_i1052" type="#_x0000_t75" alt="The&#10;&#10;Alt&#10;&#10;Text" style="width:7.5pt;height:7.5pt;visibility:visible;mso-wrap-style:square" o:bullet="t">
         <v:imagedata r:id="rId1" o:title="The&#10;&#10;Alt&#10;&#10;Text"/>
       </v:shape>
     </w:pict>
   </w:numPicBullet>
   <w:abstractNum w:abstractNumId="0" w15:restartNumberingAfterBreak="0">
-    <w:nsid w:val="012B0461"/>
+    <w:nsid w:val="00D51403"/>
     <w:multiLevelType w:val="hybridMultilevel"/>
-    <w:tmpl w:val="CB840EC8"/>
-    <w:lvl w:ilvl="0" w:tplc="0409000F">
-      <w:start w:val="1"/>
-      <w:numFmt w:val="decimal"/>
-      <w:lvlText w:val="%1."/>
-      <w:lvlJc w:val="left"/>
-      <w:pPr>
-        <w:ind w:left="720" w:hanging="360"/>
-      </w:pPr>
-    </w:lvl>
-    <w:lvl w:ilvl="1" w:tplc="04090019" w:tentative="1">
-      <w:start w:val="1"/>
-      <w:numFmt w:val="lowerLetter"/>
-      <w:lvlText w:val="%2."/>
-      <w:lvlJc w:val="left"/>
-      <w:pPr>
-        <w:ind w:left="1440" w:hanging="360"/>
-      </w:pPr>
-    </w:lvl>
-    <w:lvl w:ilvl="2" w:tplc="0409001B" w:tentative="1">
-      <w:start w:val="1"/>
-      <w:numFmt w:val="lowerRoman"/>
-      <w:lvlText w:val="%3."/>
-      <w:lvlJc w:val="right"/>
-      <w:pPr>
-        <w:ind w:left="2160" w:hanging="180"/>
-      </w:pPr>
-    </w:lvl>
-    <w:lvl w:ilvl="3" w:tplc="0409000F" w:tentative="1">
-      <w:start w:val="1"/>
-      <w:numFmt w:val="decimal"/>
-      <w:lvlText w:val="%4."/>
-      <w:lvlJc w:val="left"/>
-      <w:pPr>
-        <w:ind w:left="2880" w:hanging="360"/>
-      </w:pPr>
-    </w:lvl>
-    <w:lvl w:ilvl="4" w:tplc="04090019" w:tentative="1">
-      <w:start w:val="1"/>
-      <w:numFmt w:val="lowerLetter"/>
-      <w:lvlText w:val="%5."/>
-      <w:lvlJc w:val="left"/>
-      <w:pPr>
-        <w:ind w:left="3600" w:hanging="360"/>
-      </w:pPr>
-    </w:lvl>
-    <w:lvl w:ilvl="5" w:tplc="0409001B" w:tentative="1">
-      <w:start w:val="1"/>
-      <w:numFmt w:val="lowerRoman"/>
-      <w:lvlText w:val="%6."/>
-      <w:lvlJc w:val="right"/>
-      <w:pPr>
-        <w:ind w:left="4320" w:hanging="180"/>
-      </w:pPr>
-    </w:lvl>
-    <w:lvl w:ilvl="6" w:tplc="0409000F" w:tentative="1">
-      <w:start w:val="1"/>
-      <w:numFmt w:val="decimal"/>
-      <w:lvlText w:val="%7."/>
-      <w:lvlJc w:val="left"/>
-      <w:pPr>
-        <w:ind w:left="5040" w:hanging="360"/>
-      </w:pPr>
-    </w:lvl>
-    <w:lvl w:ilvl="7" w:tplc="04090019" w:tentative="1">
-      <w:start w:val="1"/>
-      <w:numFmt w:val="lowerLetter"/>
-      <w:lvlText w:val="%8."/>
-      <w:lvlJc w:val="left"/>
-      <w:pPr>
-        <w:ind w:left="5760" w:hanging="360"/>
-      </w:pPr>
-    </w:lvl>
-    <w:lvl w:ilvl="8" w:tplc="0409001B" w:tentative="1">
-      <w:start w:val="1"/>
-      <w:numFmt w:val="lowerRoman"/>
-      <w:lvlText w:val="%9."/>
-      <w:lvlJc w:val="right"/>
-      <w:pPr>
-        <w:ind w:left="6480" w:hanging="180"/>
-      </w:pPr>
-    </w:lvl>
-  </w:abstractNum>
-  <w:abstractNum w:abstractNumId="1" w15:restartNumberingAfterBreak="0">
-    <w:nsid w:val="369646D4"/>
-    <w:multiLevelType w:val="hybridMultilevel"/>
-    <w:tmpl w:val="0C9643C6"/>
+    <w:tmpl w:val="C8920318"/>
     <w:lvl w:ilvl="0" w:tplc="04090001">
       <w:start w:val="1"/>
       <w:numFmt w:val="bullet"/>
@@ -2589,10 +3996,96 @@
       </w:rPr>
     </w:lvl>
   </w:abstractNum>
+  <w:abstractNum w:abstractNumId="1" w15:restartNumberingAfterBreak="0">
+    <w:nsid w:val="012B0461"/>
+    <w:multiLevelType w:val="hybridMultilevel"/>
+    <w:tmpl w:val="CB840EC8"/>
+    <w:lvl w:ilvl="0" w:tplc="0409000F">
+      <w:start w:val="1"/>
+      <w:numFmt w:val="decimal"/>
+      <w:lvlText w:val="%1."/>
+      <w:lvlJc w:val="left"/>
+      <w:pPr>
+        <w:ind w:left="720" w:hanging="360"/>
+      </w:pPr>
+    </w:lvl>
+    <w:lvl w:ilvl="1" w:tplc="04090019" w:tentative="1">
+      <w:start w:val="1"/>
+      <w:numFmt w:val="lowerLetter"/>
+      <w:lvlText w:val="%2."/>
+      <w:lvlJc w:val="left"/>
+      <w:pPr>
+        <w:ind w:left="1440" w:hanging="360"/>
+      </w:pPr>
+    </w:lvl>
+    <w:lvl w:ilvl="2" w:tplc="0409001B" w:tentative="1">
+      <w:start w:val="1"/>
+      <w:numFmt w:val="lowerRoman"/>
+      <w:lvlText w:val="%3."/>
+      <w:lvlJc w:val="right"/>
+      <w:pPr>
+        <w:ind w:left="2160" w:hanging="180"/>
+      </w:pPr>
+    </w:lvl>
+    <w:lvl w:ilvl="3" w:tplc="0409000F" w:tentative="1">
+      <w:start w:val="1"/>
+      <w:numFmt w:val="decimal"/>
+      <w:lvlText w:val="%4."/>
+      <w:lvlJc w:val="left"/>
+      <w:pPr>
+        <w:ind w:left="2880" w:hanging="360"/>
+      </w:pPr>
+    </w:lvl>
+    <w:lvl w:ilvl="4" w:tplc="04090019" w:tentative="1">
+      <w:start w:val="1"/>
+      <w:numFmt w:val="lowerLetter"/>
+      <w:lvlText w:val="%5."/>
+      <w:lvlJc w:val="left"/>
+      <w:pPr>
+        <w:ind w:left="3600" w:hanging="360"/>
+      </w:pPr>
+    </w:lvl>
+    <w:lvl w:ilvl="5" w:tplc="0409001B" w:tentative="1">
+      <w:start w:val="1"/>
+      <w:numFmt w:val="lowerRoman"/>
+      <w:lvlText w:val="%6."/>
+      <w:lvlJc w:val="right"/>
+      <w:pPr>
+        <w:ind w:left="4320" w:hanging="180"/>
+      </w:pPr>
+    </w:lvl>
+    <w:lvl w:ilvl="6" w:tplc="0409000F" w:tentative="1">
+      <w:start w:val="1"/>
+      <w:numFmt w:val="decimal"/>
+      <w:lvlText w:val="%7."/>
+      <w:lvlJc w:val="left"/>
+      <w:pPr>
+        <w:ind w:left="5040" w:hanging="360"/>
+      </w:pPr>
+    </w:lvl>
+    <w:lvl w:ilvl="7" w:tplc="04090019" w:tentative="1">
+      <w:start w:val="1"/>
+      <w:numFmt w:val="lowerLetter"/>
+      <w:lvlText w:val="%8."/>
+      <w:lvlJc w:val="left"/>
+      <w:pPr>
+        <w:ind w:left="5760" w:hanging="360"/>
+      </w:pPr>
+    </w:lvl>
+    <w:lvl w:ilvl="8" w:tplc="0409001B" w:tentative="1">
+      <w:start w:val="1"/>
+      <w:numFmt w:val="lowerRoman"/>
+      <w:lvlText w:val="%9."/>
+      <w:lvlJc w:val="right"/>
+      <w:pPr>
+        <w:ind w:left="6480" w:hanging="180"/>
+      </w:pPr>
+    </w:lvl>
+  </w:abstractNum>
   <w:abstractNum w:abstractNumId="2" w15:restartNumberingAfterBreak="0">
-    <w:nsid w:val="50FC0B20"/>
+    <w:nsid w:val="369646D4"/>
     <w:multiLevelType w:val="hybridMultilevel"/>
-    <w:tmpl w:val="0A0E1832"/>
+    <w:tmpl w:val="0C9643C6"/>
     <w:lvl w:ilvl="0" w:tplc="04090001">
       <w:start w:val="1"/>
       <w:numFmt w:val="bullet"/>
@@ -2703,9 +4196,9 @@
     </w:lvl>
   </w:abstractNum>
   <w:abstractNum w:abstractNumId="3" w15:restartNumberingAfterBreak="0">
-    <w:nsid w:val="69F120C8"/>
+    <w:nsid w:val="50FC0B20"/>
     <w:multiLevelType w:val="hybridMultilevel"/>
-    <w:tmpl w:val="7D989BBE"/>
+    <w:tmpl w:val="0A0E1832"/>
     <w:lvl w:ilvl="0" w:tplc="04090001">
       <w:start w:val="1"/>
       <w:numFmt w:val="bullet"/>
@@ -2816,6 +4309,119 @@
     </w:lvl>
   </w:abstractNum>
   <w:abstractNum w:abstractNumId="4" w15:restartNumberingAfterBreak="0">
+    <w:nsid w:val="69F120C8"/>
+    <w:multiLevelType w:val="hybridMultilevel"/>
+    <w:tmpl w:val="7D989BBE"/>
+    <w:lvl w:ilvl="0" w:tplc="04090001">
+      <w:start w:val="1"/>
+      <w:numFmt w:val="bullet"/>
+      <w:lvlText w:val=""/>
+      <w:lvlJc w:val="left"/>
+      <w:pPr>
+        <w:ind w:left="720" w:hanging="360"/>
+      </w:pPr>
+      <w:rPr>
+        <w:rFonts w:ascii="Symbol" w:hAnsi="Symbol" w:hint="default"/>
+      </w:rPr>
+    </w:lvl>
+    <w:lvl w:ilvl="1" w:tplc="04090003" w:tentative="1">
+      <w:start w:val="1"/>
+      <w:numFmt w:val="bullet"/>
+      <w:lvlText w:val="o"/>
+      <w:lvlJc w:val="left"/>
+      <w:pPr>
+        <w:ind w:left="1440" w:hanging="360"/>
+      </w:pPr>
+      <w:rPr>
+        <w:rFonts w:ascii="Courier New" w:hAnsi="Courier New" w:cs="Courier New" w:hint="default"/>
+      </w:rPr>
+    </w:lvl>
+    <w:lvl w:ilvl="2" w:tplc="04090005" w:tentative="1">
+      <w:start w:val="1"/>
+      <w:numFmt w:val="bullet"/>
+      <w:lvlText w:val=""/>
+      <w:lvlJc w:val="left"/>
+      <w:pPr>
+        <w:ind w:left="2160" w:hanging="360"/>
+      </w:pPr>
+      <w:rPr>
+        <w:rFonts w:ascii="Wingdings" w:hAnsi="Wingdings" w:hint="default"/>
+      </w:rPr>
+    </w:lvl>
+    <w:lvl w:ilvl="3" w:tplc="04090001" w:tentative="1">
+      <w:start w:val="1"/>
+      <w:numFmt w:val="bullet"/>
+      <w:lvlText w:val=""/>
+      <w:lvlJc w:val="left"/>
+      <w:pPr>
+        <w:ind w:left="2880" w:hanging="360"/>
+      </w:pPr>
+      <w:rPr>
+        <w:rFonts w:ascii="Symbol" w:hAnsi="Symbol" w:hint="default"/>
+      </w:rPr>
+    </w:lvl>
+    <w:lvl w:ilvl="4" w:tplc="04090003" w:tentative="1">
+      <w:start w:val="1"/>
+      <w:numFmt w:val="bullet"/>
+      <w:lvlText w:val="o"/>
+      <w:lvlJc w:val="left"/>
+      <w:pPr>
+        <w:ind w:left="3600" w:hanging="360"/>
+      </w:pPr>
+      <w:rPr>
+        <w:rFonts w:ascii="Courier New" w:hAnsi="Courier New" w:cs="Courier New" w:hint="default"/>
+      </w:rPr>
+    </w:lvl>
+    <w:lvl w:ilvl="5" w:tplc="04090005" w:tentative="1">
+      <w:start w:val="1"/>
+      <w:numFmt w:val="bullet"/>
+      <w:lvlText w:val=""/>
+      <w:lvlJc w:val="left"/>
+      <w:pPr>
+        <w:ind w:left="4320" w:hanging="360"/>
+      </w:pPr>
+      <w:rPr>
+        <w:rFonts w:ascii="Wingdings" w:hAnsi="Wingdings" w:hint="default"/>
+      </w:rPr>
+    </w:lvl>
+    <w:lvl w:ilvl="6" w:tplc="04090001" w:tentative="1">
+      <w:start w:val="1"/>
+      <w:numFmt w:val="bullet"/>
+      <w:lvlText w:val=""/>
+      <w:lvlJc w:val="left"/>
+      <w:pPr>
+        <w:ind w:left="5040" w:hanging="360"/>
+      </w:pPr>
+      <w:rPr>
+        <w:rFonts w:ascii="Symbol" w:hAnsi="Symbol" w:hint="default"/>
+      </w:rPr>
+    </w:lvl>
+    <w:lvl w:ilvl="7" w:tplc="04090003" w:tentative="1">
+      <w:start w:val="1"/>
+      <w:numFmt w:val="bullet"/>
+      <w:lvlText w:val="o"/>
+      <w:lvlJc w:val="left"/>
+      <w:pPr>
+        <w:ind w:left="5760" w:hanging="360"/>
+      </w:pPr>
+      <w:rPr>
+        <w:rFonts w:ascii="Courier New" w:hAnsi="Courier New" w:cs="Courier New" w:hint="default"/>
+      </w:rPr>
+    </w:lvl>
+    <w:lvl w:ilvl="8" w:tplc="04090005" w:tentative="1">
+      <w:start w:val="1"/>
+      <w:numFmt w:val="bullet"/>
+      <w:lvlText w:val=""/>
+      <w:lvlJc w:val="left"/>
+      <w:pPr>
+        <w:ind w:left="6480" w:hanging="360"/>
+      </w:pPr>
+      <w:rPr>
+        <w:rFonts w:ascii="Wingdings" w:hAnsi="Wingdings" w:hint="default"/>
+      </w:rPr>
+    </w:lvl>
+  </w:abstractNum>
+  <w:abstractNum w:abstractNumId="5" w15:restartNumberingAfterBreak="0">
     <w:nsid w:val="72870258"/>
     <w:multiLevelType w:val="multilevel"/>
     <w:tmpl w:val="04090025"/>
@@ -2911,21 +4517,32 @@
     </w:lvl>
   </w:abstractNum>
   <w:num w:numId="1" w16cid:durableId="753625558">
+    <w:abstractNumId w:val="1"/>
+  </w:num>
+  <w:num w:numId="2" w16cid:durableId="901142633">
+    <w:abstractNumId w:val="5"/>
+  </w:num>
+  <w:num w:numId="3" w16cid:durableId="677007384">
+    <w:abstractNumId w:val="4"/>
+  </w:num>
+  <w:num w:numId="4" w16cid:durableId="1116485824">
+    <w:abstractNumId w:val="3"/>
+  </w:num>
+  <w:num w:numId="5" w16cid:durableId="532037974">
+    <w:abstractNumId w:val="2"/>
+  </w:num>
+  <w:num w:numId="6" w16cid:durableId="549195576">
     <w:abstractNumId w:val="0"/>
   </w:num>
-  <w:num w:numId="2" w16cid:durableId="901142633">
-    <w:abstractNumId w:val="4"/>
-  </w:num>
-  <w:num w:numId="3" w16cid:durableId="677007384">
-    <w:abstractNumId w:val="3"/>
-  </w:num>
-  <w:num w:numId="4" w16cid:durableId="1116485824">
-    <w:abstractNumId w:val="2"/>
-  </w:num>
-  <w:num w:numId="5" w16cid:durableId="532037974">
-    <w:abstractNumId w:val="1"/>
-  </w:num>
 </w:numbering>
+</file>
+
+<file path=word/people.xml><?xml version="1.0" encoding="utf-8"?>
+<w15:people xmlns:wpc="http://schemas.microsoft.com/office/word/2010/wordprocessingCanvas" xmlns:cx="http://schemas.microsoft.com/office/drawing/2014/chartex" xmlns:cx1="http://schemas.microsoft.com/office/drawing/2015/9/8/chartex" xmlns:cx2="http://schemas.microsoft.com/office/drawing/2015/10/21/chartex" xmlns:cx3="http://schemas.microsoft.com/office/drawing/2016/5/9/chartex" xmlns:cx4="http://schemas.microsoft.com/office/drawing/2016/5/10/chartex" xmlns:cx5="http://schemas.microsoft.com/office/drawing/2016/5/11/chartex" xmlns:cx6="http://schemas.microsoft.com/office/drawing/2016/5/12/chartex" xmlns:cx7="http://schemas.microsoft.com/office/drawing/2016/5/13/chartex" xmlns:cx8="http://schemas.microsoft.com/office/drawing/2016/5/14/chartex" xmlns:mc="http://schemas.openxmlformats.org/markup-compatibility/2006" xmlns:aink="http://schemas.microsoft.com/office/drawing/2016/ink" xmlns:am3d="http://schemas.microsoft.com/office/drawing/2017/model3d" xmlns:o="urn:schemas-microsoft-com:office:office" xmlns:oel="http://schemas.microsoft.com/office/2019/extlst" xmlns:r="http://schemas.openxmlformats.org/officeDocument/2006/relationships" xmlns:m="http://schemas.openxmlformats.org/officeDocument/2006/math" xmlns:v="urn:schemas-microsoft-com:vml" xmlns:wp14="http://schemas.microsoft.com/office/word/2010/wordprocessingDrawing" xmlns:wp="http://schemas.openxmlformats.org/drawingml/2006/wordprocessingDrawing" xmlns:w10="urn:schemas-microsoft-com:office:word" xmlns:w="http://schemas.openxmlformats.org/wordprocessingml/2006/main" xmlns:w14="http://schemas.microsoft.com/office/word/2010/wordml" xmlns:w15="http://schemas.microsoft.com/office/word/2012/wordml" xmlns:w16cex="http://schemas.microsoft.com/office/word/2018/wordml/cex" xmlns:w16cid="http://schemas.microsoft.com/office/word/2016/wordml/cid" xmlns:w16="http://schemas.microsoft.com/office/word/2018/wordml" xmlns:w16du="http://schemas.microsoft.com/office/word/2023/wordml/word16du" xmlns:w16sdtdh="http://schemas.microsoft.com/office/word/2020/wordml/sdtdatahash" xmlns:w16sdtfl="http://schemas.microsoft.com/office/word/2024/wordml/sdtformatlock" xmlns:w16se="http://schemas.microsoft.com/office/word/2015/wordml/symex" xmlns:wpg="http://schemas.microsoft.com/office/word/2010/wordprocessingGroup" xmlns:wpi="http://schemas.microsoft.com/office/word/2010/wordprocessingInk" xmlns:wne="http://schemas.microsoft.com/office/word/2006/wordml" xmlns:wps="http://schemas.microsoft.com/office/word/2010/wordprocessingShape" mc:Ignorable="w14 w15 w16se w16cid w16 w16cex w16sdtdh w16sdtfl w16du wp14">
+  <w15:person w15:author="Pawel KAMINSKI">
+    <w15:presenceInfo w15:providerId="AD" w15:userId="S::pawel.kaminski@uni.lu::d0336c22-f4bd-4524-ae20-e461efb9be46"/>
+  </w15:person>
+</w15:people>
 </file>
 
 <file path=word/styles.xml><?xml version="1.0" encoding="utf-8"?>
@@ -3100,7 +4717,7 @@
     <w:lsdException w:name="Table Web 2" w:semiHidden="1" w:unhideWhenUsed="1"/>
     <w:lsdException w:name="Table Web 3" w:semiHidden="1" w:unhideWhenUsed="1"/>
     <w:lsdException w:name="Balloon Text" w:semiHidden="1" w:unhideWhenUsed="1"/>
-    <w:lsdException w:name="Table Grid" w:uiPriority="59"/>
+    <w:lsdException w:name="Table Grid" w:uiPriority="0"/>
     <w:lsdException w:name="Table Theme" w:semiHidden="1" w:unhideWhenUsed="1"/>
     <w:lsdException w:name="Placeholder Text" w:semiHidden="1"/>
     <w:lsdException w:name="No Spacing" w:uiPriority="1" w:qFormat="1"/>
@@ -3886,7 +5503,6 @@
   <w:style w:type="table" w:styleId="TableGrid">
     <w:name w:val="Table Grid"/>
     <w:basedOn w:val="TableNormal"/>
-    <w:uiPriority w:val="59"/>
     <w:rsid w:val="00A07581"/>
     <w:pPr>
       <w:spacing w:after="0" w:line="240" w:lineRule="auto"/>

</xml_diff>

<commit_message>
Reenable test of adding file count before references
</commit_message>
<xml_diff>
--- a/tests/_fixtures/split-to-multiple-chapters/manuscript.docx
+++ b/tests/_fixtures/split-to-multiple-chapters/manuscript.docx
@@ -1144,16 +1144,10 @@
         <w:fldChar w:fldCharType="separate"/>
       </w:r>
       <w:r>
-        <w:rPr>
-          <w:b/>
-          <w:bCs/>
-        </w:rPr>
         <w:t xml:space="preserve">Figure </w:t>
       </w:r>
       <w:r>
         <w:rPr>
-          <w:b/>
-          <w:bCs/>
           <w:noProof/>
         </w:rPr>
         <w:t>1</w:t>
@@ -1162,10 +1156,7 @@
         <w:fldChar w:fldCharType="end"/>
       </w:r>
       <w:r>
-        <w:t xml:space="preserve"> and </w:t>
-      </w:r>
-      <w:r>
-        <w:t xml:space="preserve">to </w:t>
+        <w:t xml:space="preserve"> and to </w:t>
       </w:r>
       <w:r>
         <w:fldChar w:fldCharType="begin"/>
@@ -1366,7 +1357,10 @@
         <w:fldChar w:fldCharType="end"/>
       </w:r>
       <w:r>
-        <w:t xml:space="preserve"> (as a bookmark), to </w:t>
+        <w:t xml:space="preserve"> (as a bookmark), </w:t>
+      </w:r>
+      <w:r>
+        <w:t xml:space="preserve">to </w:t>
       </w:r>
       <w:r>
         <w:fldChar w:fldCharType="begin"/>
@@ -1381,16 +1375,10 @@
         <w:fldChar w:fldCharType="separate"/>
       </w:r>
       <w:r>
-        <w:rPr>
-          <w:b/>
-          <w:bCs/>
-        </w:rPr>
         <w:t xml:space="preserve">Figure </w:t>
       </w:r>
       <w:r>
         <w:rPr>
-          <w:b/>
-          <w:bCs/>
           <w:noProof/>
         </w:rPr>
         <w:t>3</w:t>
@@ -1417,16 +1405,10 @@
         <w:fldChar w:fldCharType="separate"/>
       </w:r>
       <w:r>
-        <w:rPr>
-          <w:b/>
-          <w:bCs/>
-        </w:rPr>
         <w:t xml:space="preserve">Table </w:t>
       </w:r>
       <w:r>
         <w:rPr>
-          <w:b/>
-          <w:bCs/>
           <w:noProof/>
         </w:rPr>
         <w:t>2</w:t>
@@ -1525,16 +1507,12 @@
       </w:r>
       <w:r>
         <w:rPr>
-          <w:b/>
-          <w:bCs/>
           <w:iCs/>
         </w:rPr>
         <w:t xml:space="preserve">Figure </w:t>
       </w:r>
       <w:r>
         <w:rPr>
-          <w:b/>
-          <w:bCs/>
           <w:iCs/>
           <w:noProof/>
         </w:rPr>
@@ -1559,26 +1537,19 @@
         <w:fldChar w:fldCharType="begin"/>
       </w:r>
       <w:r>
-        <w:instrText xml:space="preserve"> REF _Ref216168684 \h </w:instrText>
-      </w:r>
-      <w:r>
-        <w:instrText xml:space="preserve"> \* MERGEFORMAT </w:instrText>
+        <w:instrText xml:space="preserve"> REF _Ref216168684 \h  \* MERGEFORMAT </w:instrText>
       </w:r>
       <w:r>
         <w:fldChar w:fldCharType="separate"/>
       </w:r>
       <w:r>
         <w:rPr>
-          <w:b/>
-          <w:bCs/>
           <w:iCs/>
         </w:rPr>
         <w:t xml:space="preserve">Figure </w:t>
       </w:r>
       <w:r>
         <w:rPr>
-          <w:b/>
-          <w:bCs/>
           <w:iCs/>
           <w:noProof/>
         </w:rPr>
@@ -1600,26 +1571,19 @@
         <w:fldChar w:fldCharType="begin"/>
       </w:r>
       <w:r>
-        <w:instrText xml:space="preserve"> REF _Ref216168694 \h </w:instrText>
-      </w:r>
-      <w:r>
-        <w:instrText xml:space="preserve"> \* MERGEFORMAT </w:instrText>
+        <w:instrText xml:space="preserve"> REF _Ref216168694 \h  \* MERGEFORMAT </w:instrText>
       </w:r>
       <w:r>
         <w:fldChar w:fldCharType="separate"/>
       </w:r>
       <w:r>
         <w:rPr>
-          <w:b/>
-          <w:bCs/>
           <w:iCs/>
         </w:rPr>
         <w:t xml:space="preserve">Figure </w:t>
       </w:r>
       <w:r>
         <w:rPr>
-          <w:b/>
-          <w:bCs/>
           <w:iCs/>
           <w:noProof/>
         </w:rPr>
@@ -2448,8 +2412,8 @@
           <w:highlight w:val="lightGray"/>
         </w:rPr>
       </w:pPr>
-      <w:bookmarkStart w:id="19" w:name="_Ref216168647"/>
-      <w:bookmarkStart w:id="20" w:name="_Ref216168653"/>
+      <w:bookmarkStart w:id="19" w:name="_Ref216168653"/>
+      <w:bookmarkStart w:id="20" w:name="_Ref216168647"/>
       <w:bookmarkStart w:id="21" w:name="fig_onlyDigital"/>
       <w:r>
         <w:rPr>
@@ -2512,26 +2476,26 @@
         </w:rPr>
         <w:fldChar w:fldCharType="end"/>
       </w:r>
+      <w:bookmarkEnd w:id="19"/>
+      <w:r>
+        <w:rPr>
+          <w:b/>
+          <w:bCs/>
+          <w:i w:val="0"/>
+          <w:iCs/>
+          <w:highlight w:val="lightGray"/>
+        </w:rPr>
+        <w:t>:</w:t>
+      </w:r>
+      <w:r>
+        <w:rPr>
+          <w:i w:val="0"/>
+          <w:iCs/>
+          <w:highlight w:val="lightGray"/>
+        </w:rPr>
+        <w:t xml:space="preserve"> Figure only in digital version.</w:t>
+      </w:r>
       <w:bookmarkEnd w:id="20"/>
-      <w:r>
-        <w:rPr>
-          <w:b/>
-          <w:bCs/>
-          <w:i w:val="0"/>
-          <w:iCs/>
-          <w:highlight w:val="lightGray"/>
-        </w:rPr>
-        <w:t>:</w:t>
-      </w:r>
-      <w:r>
-        <w:rPr>
-          <w:i w:val="0"/>
-          <w:iCs/>
-          <w:highlight w:val="lightGray"/>
-        </w:rPr>
-        <w:t xml:space="preserve"> Figure only in digital version.</w:t>
-      </w:r>
-      <w:bookmarkEnd w:id="19"/>
     </w:p>
     <w:bookmarkEnd w:id="21"/>
     <w:p>
@@ -3878,7 +3842,7 @@
         <v:path o:extrusionok="f" gradientshapeok="t" o:connecttype="rect"/>
         <o:lock v:ext="edit" aspectratio="t"/>
       </v:shapetype>
-      <v:shape id="_x0000_i1052" type="#_x0000_t75" alt="The&#10;&#10;Alt&#10;&#10;Text" style="width:7.5pt;height:7.5pt;visibility:visible;mso-wrap-style:square" o:bullet="t">
+      <v:shape id="_x0000_i1026" type="#_x0000_t75" alt="The&#10;&#10;Alt&#10;&#10;Text" style="width:7.5pt;height:7.5pt;visibility:visible;mso-wrap-style:square" o:bullet="t">
         <v:imagedata r:id="rId1" o:title="The&#10;&#10;Alt&#10;&#10;Text"/>
       </v:shape>
     </w:pict>

</xml_diff>